<commit_message>
Init authentication pipeline: login and register
</commit_message>
<xml_diff>
--- a/TP01/Submission/TP01 T0X Thao Duy.docx
+++ b/TP01/Submission/TP01 T0X Thao Duy.docx
@@ -1,6 +1,6 @@
 
 <file path=word/document.xml><?xml version="1.0" encoding="utf-8"?>
-<w:document xmlns:wpc="http://schemas.microsoft.com/office/word/2010/wordprocessingCanvas" xmlns:cx="http://schemas.microsoft.com/office/drawing/2014/chartex" xmlns:cx1="http://schemas.microsoft.com/office/drawing/2015/9/8/chartex" xmlns:cx2="http://schemas.microsoft.com/office/drawing/2015/10/21/chartex" xmlns:cx3="http://schemas.microsoft.com/office/drawing/2016/5/9/chartex" xmlns:cx4="http://schemas.microsoft.com/office/drawing/2016/5/10/chartex" xmlns:cx5="http://schemas.microsoft.com/office/drawing/2016/5/11/chartex" xmlns:cx6="http://schemas.microsoft.com/office/drawing/2016/5/12/chartex" xmlns:cx7="http://schemas.microsoft.com/office/drawing/2016/5/13/chartex" xmlns:cx8="http://schemas.microsoft.com/office/drawing/2016/5/14/chartex" xmlns:mc="http://schemas.openxmlformats.org/markup-compatibility/2006" xmlns:aink="http://schemas.microsoft.com/office/drawing/2016/ink" xmlns:am3d="http://schemas.microsoft.com/office/drawing/2017/model3d" xmlns:o="urn:schemas-microsoft-com:office:office" xmlns:oel="http://schemas.microsoft.com/office/2019/extlst" xmlns:r="http://schemas.openxmlformats.org/officeDocument/2006/relationships" xmlns:m="http://schemas.openxmlformats.org/officeDocument/2006/math" xmlns:v="urn:schemas-microsoft-com:vml" xmlns:wp14="http://schemas.microsoft.com/office/word/2010/wordprocessingDrawing" xmlns:wp="http://schemas.openxmlformats.org/drawingml/2006/wordprocessingDrawing" xmlns:w10="urn:schemas-microsoft-com:office:word" xmlns:w="http://schemas.openxmlformats.org/wordprocessingml/2006/main" xmlns:w14="http://schemas.microsoft.com/office/word/2010/wordml" xmlns:w15="http://schemas.microsoft.com/office/word/2012/wordml" xmlns:w16cex="http://schemas.microsoft.com/office/word/2018/wordml/cex" xmlns:w16cid="http://schemas.microsoft.com/office/word/2016/wordml/cid" xmlns:w16="http://schemas.microsoft.com/office/word/2018/wordml" xmlns:w16du="http://schemas.microsoft.com/office/word/2023/wordml/word16du" xmlns:w16sdtdh="http://schemas.microsoft.com/office/word/2020/wordml/sdtdatahash" xmlns:w16sdtfl="http://schemas.microsoft.com/office/word/2024/wordml/sdtformatlock" xmlns:w16se="http://schemas.microsoft.com/office/word/2015/wordml/symex" xmlns:wpg="http://schemas.microsoft.com/office/word/2010/wordprocessingGroup" xmlns:wpi="http://schemas.microsoft.com/office/word/2010/wordprocessingInk" xmlns:wne="http://schemas.microsoft.com/office/word/2006/wordml" xmlns:wps="http://schemas.microsoft.com/office/word/2010/wordprocessingShape" xmlns:a="http://schemas.openxmlformats.org/drawingml/2006/main" xmlns:pic="http://schemas.openxmlformats.org/drawingml/2006/picture" xmlns:a14="http://schemas.microsoft.com/office/drawing/2010/main" mc:Ignorable="w14 w15 w16se w16cid w16 w16cex w16sdtdh w16sdtfl w16du wp14">
+<w:document xmlns:wpc="http://schemas.microsoft.com/office/word/2010/wordprocessingCanvas" xmlns:cx="http://schemas.microsoft.com/office/drawing/2014/chartex" xmlns:cx1="http://schemas.microsoft.com/office/drawing/2015/9/8/chartex" xmlns:cx2="http://schemas.microsoft.com/office/drawing/2015/10/21/chartex" xmlns:cx3="http://schemas.microsoft.com/office/drawing/2016/5/9/chartex" xmlns:cx4="http://schemas.microsoft.com/office/drawing/2016/5/10/chartex" xmlns:cx5="http://schemas.microsoft.com/office/drawing/2016/5/11/chartex" xmlns:cx6="http://schemas.microsoft.com/office/drawing/2016/5/12/chartex" xmlns:cx7="http://schemas.microsoft.com/office/drawing/2016/5/13/chartex" xmlns:cx8="http://schemas.microsoft.com/office/drawing/2016/5/14/chartex" xmlns:mc="http://schemas.openxmlformats.org/markup-compatibility/2006" xmlns:aink="http://schemas.microsoft.com/office/drawing/2016/ink" xmlns:am3d="http://schemas.microsoft.com/office/drawing/2017/model3d" xmlns:o="urn:schemas-microsoft-com:office:office" xmlns:oel="http://schemas.microsoft.com/office/2019/extlst" xmlns:r="http://schemas.openxmlformats.org/officeDocument/2006/relationships" xmlns:m="http://schemas.openxmlformats.org/officeDocument/2006/math" xmlns:v="urn:schemas-microsoft-com:vml" xmlns:wp14="http://schemas.microsoft.com/office/word/2010/wordprocessingDrawing" xmlns:wp="http://schemas.openxmlformats.org/drawingml/2006/wordprocessingDrawing" xmlns:w10="urn:schemas-microsoft-com:office:word" xmlns:w="http://schemas.openxmlformats.org/wordprocessingml/2006/main" xmlns:w14="http://schemas.microsoft.com/office/word/2010/wordml" xmlns:w15="http://schemas.microsoft.com/office/word/2012/wordml" xmlns:w16cei="http://schemas.microsoft.com/office/word/2026/wordml/cei" xmlns:w16cex="http://schemas.microsoft.com/office/word/2018/wordml/cex" xmlns:w16cid="http://schemas.microsoft.com/office/word/2016/wordml/cid" xmlns:w16="http://schemas.microsoft.com/office/word/2018/wordml" xmlns:w16du="http://schemas.microsoft.com/office/word/2023/wordml/word16du" xmlns:w16sdtdh="http://schemas.microsoft.com/office/word/2020/wordml/sdtdatahash" xmlns:w16sdtfl="http://schemas.microsoft.com/office/word/2024/wordml/sdtformatlock" xmlns:w16se="http://schemas.microsoft.com/office/word/2015/wordml/symex" xmlns:wpg="http://schemas.microsoft.com/office/word/2010/wordprocessingGroup" xmlns:wpi="http://schemas.microsoft.com/office/word/2010/wordprocessingInk" xmlns:wne="http://schemas.microsoft.com/office/word/2006/wordml" xmlns:wps="http://schemas.microsoft.com/office/word/2010/wordprocessingShape" xmlns:a="http://schemas.openxmlformats.org/drawingml/2006/main" xmlns:pic="http://schemas.openxmlformats.org/drawingml/2006/picture" xmlns:a14="http://schemas.microsoft.com/office/drawing/2010/main" mc:Ignorable="w14 w15 w16se w16cid w16 w16cex w16sdtdh w16sdtfl w16du wp14">
   <w:body>
     <w:p>
       <w:pPr>
@@ -73,17 +73,14 @@
     <w:p>
       <w:pPr>
         <w:jc w:val="center"/>
+      </w:pPr>
+      <w:r>
         <w:rPr>
           <w:rFonts w:ascii="Verdana" w:hAnsi="Verdana" w:cs="Arial"/>
         </w:rPr>
-      </w:pPr>
-      <w:r>
-        <w:rPr>
-          <w:rFonts w:ascii="Verdana" w:hAnsi="Verdana" w:cs="Arial"/>
-        </w:rPr>
         <w:t xml:space="preserve">Thao H. B. Bui – </w:t>
       </w:r>
-      <w:hyperlink w:tgtFrame="_blank" w:history="1" r:id="rId10">
+      <w:hyperlink r:id="Re1441752af314350">
         <w:r>
           <w:rPr>
             <w:rStyle w:val="Hyperlink"/>
@@ -103,6 +100,34 @@
       <w:pPr>
         <w:jc w:val="center"/>
         <w:rPr>
+          <w:sz w:val="24"/>
+          <w:szCs w:val="24"/>
+        </w:rPr>
+      </w:pPr>
+      <w:r>
+        <w:rPr>
+          <w:rFonts w:ascii="Verdana" w:hAnsi="Verdana" w:eastAsia="Verdana" w:cs="Verdana"/>
+          <w:sz w:val="24"/>
+          <w:szCs w:val="24"/>
+        </w:rPr>
+        <w:t xml:space="preserve">Duy K. Bui - </w:t>
+      </w:r>
+      <w:hyperlink r:id="R2c599dc209144f08">
+        <w:r>
+          <w:rPr>
+            <w:rStyle w:val="Hyperlink"/>
+            <w:rFonts w:ascii="Verdana" w:hAnsi="Verdana" w:eastAsia="Verdana" w:cs="Verdana"/>
+            <w:sz w:val="24"/>
+            <w:szCs w:val="24"/>
+          </w:rPr>
+          <w:t>buikhanhduy@cityuniversity.edu</w:t>
+        </w:r>
+      </w:hyperlink>
+    </w:p>
+    <w:p>
+      <w:pPr>
+        <w:jc w:val="center"/>
+        <w:rPr>
           <w:rFonts w:ascii="Verdana" w:hAnsi="Verdana" w:cs="Arial"/>
         </w:rPr>
       </w:pPr>
@@ -627,7 +652,57 @@
           <w:sz w:val="18"/>
           <w:szCs w:val="18"/>
         </w:rPr>
-        <w:t xml:space="preserve">Within this formula, each variable </w:t>
+        <w:t xml:space="preserve">Within this formula, </w:t>
+      </w:r>
+      <w:r>
+        <w:rPr>
+          <w:rFonts w:ascii="Verdana" w:hAnsi="Verdana"/>
+          <w:sz w:val="18"/>
+          <w:szCs w:val="18"/>
+        </w:rPr>
+        <w:t xml:space="preserve">according to </w:t>
+      </w:r>
+      <w:proofErr w:type="spellStart"/>
+      <w:r>
+        <w:rPr>
+          <w:rFonts w:ascii="Verdana" w:hAnsi="Verdana"/>
+          <w:sz w:val="18"/>
+          <w:szCs w:val="18"/>
+        </w:rPr>
+        <w:t>Temoshok</w:t>
+      </w:r>
+      <w:proofErr w:type="spellEnd"/>
+      <w:r>
+        <w:rPr>
+          <w:rFonts w:ascii="Verdana" w:hAnsi="Verdana"/>
+          <w:sz w:val="18"/>
+          <w:szCs w:val="18"/>
+        </w:rPr>
+        <w:t xml:space="preserve"> et al.</w:t>
+      </w:r>
+      <w:r>
+        <w:rPr>
+          <w:rFonts w:ascii="Verdana" w:hAnsi="Verdana"/>
+          <w:sz w:val="18"/>
+          <w:szCs w:val="18"/>
+        </w:rPr>
+        <w:t xml:space="preserve"> </w:t>
+      </w:r>
+      <w:r>
+        <w:rPr>
+          <w:rFonts w:ascii="Verdana" w:hAnsi="Verdana"/>
+          <w:sz w:val="18"/>
+          <w:szCs w:val="18"/>
+        </w:rPr>
+        <w:t xml:space="preserve">(2025), </w:t>
+      </w:r>
+      <w:r>
+        <w:rPr>
+          <w:rFonts w:ascii="Verdana" w:hAnsi="Verdana"/>
+          <w:sz w:val="18"/>
+          <w:szCs w:val="18"/>
+        </w:rPr>
+        <w:t xml:space="preserve">each variable </w:t>
       </w:r>
       <w:r>
         <w:rPr>
@@ -659,7 +734,15 @@
           <w:sz w:val="18"/>
           <w:szCs w:val="18"/>
         </w:rPr>
-        <w:t xml:space="preserve"> is more </w:t>
+        <w:t xml:space="preserve"> is </w:t>
+      </w:r>
+      <w:r>
+        <w:rPr>
+          <w:rFonts w:ascii="Verdana" w:hAnsi="Verdana"/>
+          <w:sz w:val="18"/>
+          <w:szCs w:val="18"/>
+        </w:rPr>
+        <w:t xml:space="preserve">more </w:t>
       </w:r>
       <w:r>
         <w:rPr>
@@ -696,22 +779,17 @@
     </w:p>
     <w:p>
       <w:pPr>
-        <w:pStyle w:val="Normal"/>
-        <w:jc w:val="both"/>
-        <w:rPr>
-          <w:rFonts w:ascii="Verdana" w:hAnsi="Verdana"/>
-          <w:sz w:val="18"/>
-          <w:szCs w:val="18"/>
-        </w:rPr>
-      </w:pPr>
-    </w:p>
-    <w:p>
-      <w:pPr>
-        <w:pStyle w:val="Normal"/>
-        <w:suppressLineNumbers w:val="0"/>
-        <w:bidi w:val="0"/>
-        <w:spacing w:before="0" w:beforeAutospacing="off" w:after="0" w:afterAutospacing="off" w:line="259" w:lineRule="auto"/>
-        <w:ind w:left="0" w:right="0"/>
+        <w:jc w:val="both"/>
+        <w:rPr>
+          <w:rFonts w:ascii="Verdana" w:hAnsi="Verdana"/>
+          <w:sz w:val="18"/>
+          <w:szCs w:val="18"/>
+        </w:rPr>
+      </w:pPr>
+    </w:p>
+    <w:p>
+      <w:pPr>
+        <w:spacing w:line="259" w:lineRule="auto"/>
         <w:jc w:val="both"/>
         <w:rPr>
           <w:rFonts w:ascii="Verdana" w:hAnsi="Verdana"/>
@@ -733,7 +811,71 @@
           <w:sz w:val="18"/>
           <w:szCs w:val="18"/>
         </w:rPr>
-        <w:t>demonstrated</w:t>
+        <w:t xml:space="preserve">demonstrated </w:t>
+      </w:r>
+      <w:r>
+        <w:rPr>
+          <w:rFonts w:ascii="Verdana" w:hAnsi="Verdana"/>
+          <w:sz w:val="18"/>
+          <w:szCs w:val="18"/>
+        </w:rPr>
+        <w:t>in the NIST Special Publication 800-63B</w:t>
+      </w:r>
+      <w:r>
+        <w:rPr>
+          <w:rFonts w:ascii="Verdana" w:hAnsi="Verdana"/>
+          <w:sz w:val="18"/>
+          <w:szCs w:val="18"/>
+        </w:rPr>
+        <w:t xml:space="preserve"> document</w:t>
+      </w:r>
+      <w:r>
+        <w:rPr>
+          <w:rFonts w:ascii="Verdana" w:hAnsi="Verdana"/>
+          <w:sz w:val="18"/>
+          <w:szCs w:val="18"/>
+        </w:rPr>
+        <w:t xml:space="preserve">, which splits security </w:t>
+      </w:r>
+      <w:r>
+        <w:rPr>
+          <w:rFonts w:ascii="Verdana" w:hAnsi="Verdana"/>
+          <w:sz w:val="18"/>
+          <w:szCs w:val="18"/>
+        </w:rPr>
+        <w:t xml:space="preserve">systems </w:t>
+      </w:r>
+      <w:r>
+        <w:rPr>
+          <w:rFonts w:ascii="Verdana" w:hAnsi="Verdana"/>
+          <w:sz w:val="18"/>
+          <w:szCs w:val="18"/>
+        </w:rPr>
+        <w:t xml:space="preserve">into 3 levels of </w:t>
+      </w:r>
+      <w:r>
+        <w:rPr>
+          <w:rFonts w:ascii="Verdana" w:hAnsi="Verdana"/>
+          <w:sz w:val="18"/>
+          <w:szCs w:val="18"/>
+        </w:rPr>
+        <w:t>Authenticator Assurance Level</w:t>
+      </w:r>
+      <w:r>
+        <w:rPr>
+          <w:rFonts w:ascii="Verdana" w:hAnsi="Verdana"/>
+          <w:sz w:val="18"/>
+          <w:szCs w:val="18"/>
+        </w:rPr>
+        <w:t xml:space="preserve"> (AAL), ranging from 1 to 3. </w:t>
+      </w:r>
+      <w:r>
+        <w:rPr>
+          <w:rFonts w:ascii="Verdana" w:hAnsi="Verdana"/>
+          <w:sz w:val="18"/>
+          <w:szCs w:val="18"/>
+        </w:rPr>
+        <w:t>On the lowest scale, authentication is at least secured, including implementing only one factor of verification.</w:t>
       </w:r>
       <w:r>
         <w:rPr>
@@ -744,90 +886,8 @@
         <w:t xml:space="preserve"> </w:t>
       </w:r>
       <w:r>
-        <w:rPr>
-          <w:rFonts w:ascii="Verdana" w:hAnsi="Verdana"/>
-          <w:sz w:val="18"/>
-          <w:szCs w:val="18"/>
-        </w:rPr>
-        <w:t>in the NIST Special Publication 800-63B</w:t>
-      </w:r>
-      <w:r>
-        <w:rPr>
-          <w:rFonts w:ascii="Verdana" w:hAnsi="Verdana"/>
-          <w:sz w:val="18"/>
-          <w:szCs w:val="18"/>
-        </w:rPr>
-        <w:t xml:space="preserve"> document</w:t>
-      </w:r>
-      <w:r>
-        <w:rPr>
-          <w:rFonts w:ascii="Verdana" w:hAnsi="Verdana"/>
-          <w:sz w:val="18"/>
-          <w:szCs w:val="18"/>
-        </w:rPr>
-        <w:t xml:space="preserve">, which splits security </w:t>
-      </w:r>
-      <w:r>
-        <w:rPr>
-          <w:rFonts w:ascii="Verdana" w:hAnsi="Verdana"/>
-          <w:sz w:val="18"/>
-          <w:szCs w:val="18"/>
-        </w:rPr>
-        <w:t xml:space="preserve">systems </w:t>
-      </w:r>
-      <w:r>
-        <w:rPr>
-          <w:rFonts w:ascii="Verdana" w:hAnsi="Verdana"/>
-          <w:sz w:val="18"/>
-          <w:szCs w:val="18"/>
-        </w:rPr>
-        <w:t xml:space="preserve">into 3 levels of </w:t>
-      </w:r>
-      <w:r>
-        <w:rPr>
-          <w:rFonts w:ascii="Verdana" w:hAnsi="Verdana"/>
-          <w:sz w:val="18"/>
-          <w:szCs w:val="18"/>
-        </w:rPr>
-        <w:t>Authenticator Assurance Level</w:t>
-      </w:r>
-      <w:r>
-        <w:rPr>
-          <w:rFonts w:ascii="Verdana" w:hAnsi="Verdana"/>
-          <w:sz w:val="18"/>
-          <w:szCs w:val="18"/>
-        </w:rPr>
-        <w:t xml:space="preserve"> (AAL), ranging from 1 to 3. </w:t>
-      </w:r>
-      <w:r>
-        <w:rPr>
-          <w:rFonts w:ascii="Verdana" w:hAnsi="Verdana"/>
-          <w:sz w:val="18"/>
-          <w:szCs w:val="18"/>
-        </w:rPr>
-        <w:t>On the lowest scale, authentication is at least secured, including implementing only one factor of verification.</w:t>
-      </w:r>
-      <w:r>
-        <w:rPr>
-          <w:rFonts w:ascii="Verdana" w:hAnsi="Verdana"/>
-          <w:sz w:val="18"/>
-          <w:szCs w:val="18"/>
-        </w:rPr>
-        <w:t xml:space="preserve"> </w:t>
-      </w:r>
-      <w:r>
         <w:br/>
       </w:r>
-    </w:p>
-    <w:p>
-      <w:pPr>
-        <w:jc w:val="both"/>
-        <w:rPr>
-          <w:rFonts w:ascii="Verdana" w:hAnsi="Verdana"/>
-          <w:sz w:val="18"/>
-          <w:szCs w:val="18"/>
-        </w:rPr>
-      </w:pPr>
     </w:p>
     <w:p>
       <w:pPr>
@@ -858,42 +918,25 @@
     </w:p>
     <w:p>
       <w:pPr>
-        <w:pStyle w:val="Normal"/>
-        <w:jc w:val="both"/>
-        <w:rPr>
-          <w:rFonts w:ascii="Verdana" w:hAnsi="Verdana"/>
-          <w:sz w:val="18"/>
-          <w:szCs w:val="18"/>
-        </w:rPr>
-      </w:pPr>
-    </w:p>
-    <w:p>
-      <w:pPr>
-        <w:jc w:val="both"/>
-      </w:pPr>
-      <w:r>
-        <w:rPr>
-          <w:rFonts w:ascii="Verdana" w:hAnsi="Verdana"/>
-          <w:sz w:val="18"/>
-          <w:szCs w:val="18"/>
-        </w:rPr>
-        <w:t xml:space="preserve">This is the simplest and most common method of authentication, which requires users to </w:t>
-      </w:r>
-      <w:r>
-        <w:rPr>
-          <w:rFonts w:ascii="Verdana" w:hAnsi="Verdana"/>
-          <w:sz w:val="18"/>
-          <w:szCs w:val="18"/>
-        </w:rPr>
-        <w:t>submit</w:t>
-      </w:r>
-      <w:r>
-        <w:rPr>
-          <w:rFonts w:ascii="Verdana" w:hAnsi="Verdana"/>
-          <w:sz w:val="18"/>
-          <w:szCs w:val="18"/>
-        </w:rPr>
-        <w:t xml:space="preserve"> a username (or email) and password to verify </w:t>
+        <w:jc w:val="both"/>
+        <w:rPr>
+          <w:rFonts w:ascii="Verdana" w:hAnsi="Verdana"/>
+          <w:sz w:val="18"/>
+          <w:szCs w:val="18"/>
+        </w:rPr>
+      </w:pPr>
+    </w:p>
+    <w:p>
+      <w:pPr>
+        <w:jc w:val="both"/>
+      </w:pPr>
+      <w:r>
+        <w:rPr>
+          <w:rFonts w:ascii="Verdana" w:hAnsi="Verdana"/>
+          <w:sz w:val="18"/>
+          <w:szCs w:val="18"/>
+        </w:rPr>
+        <w:t xml:space="preserve">This is the simplest and most common method of authentication, which requires users to submit a username (or email) and password to verify </w:t>
       </w:r>
       <w:r>
         <w:rPr>
@@ -925,7 +968,49 @@
           <w:sz w:val="18"/>
           <w:szCs w:val="18"/>
         </w:rPr>
-        <w:t>vulnerabilities.</w:t>
+        <w:t>vulnerabilities</w:t>
+      </w:r>
+      <w:r>
+        <w:rPr>
+          <w:rFonts w:ascii="Verdana" w:hAnsi="Verdana"/>
+          <w:sz w:val="18"/>
+          <w:szCs w:val="18"/>
+        </w:rPr>
+        <w:t xml:space="preserve"> </w:t>
+      </w:r>
+      <w:r>
+        <w:rPr>
+          <w:rFonts w:ascii="Verdana" w:hAnsi="Verdana"/>
+          <w:sz w:val="18"/>
+          <w:szCs w:val="18"/>
+        </w:rPr>
+        <w:t>(</w:t>
+      </w:r>
+      <w:proofErr w:type="spellStart"/>
+      <w:r>
+        <w:rPr>
+          <w:rFonts w:ascii="Verdana" w:hAnsi="Verdana"/>
+          <w:sz w:val="18"/>
+          <w:szCs w:val="18"/>
+        </w:rPr>
+        <w:t>Temoshok</w:t>
+      </w:r>
+      <w:proofErr w:type="spellEnd"/>
+      <w:r>
+        <w:rPr>
+          <w:rFonts w:ascii="Verdana" w:hAnsi="Verdana"/>
+          <w:sz w:val="18"/>
+          <w:szCs w:val="18"/>
+        </w:rPr>
+        <w:t xml:space="preserve"> et al., 2025)</w:t>
+      </w:r>
+      <w:r>
+        <w:rPr>
+          <w:rFonts w:ascii="Verdana" w:hAnsi="Verdana"/>
+          <w:sz w:val="18"/>
+          <w:szCs w:val="18"/>
+        </w:rPr>
+        <w:t>.</w:t>
       </w:r>
     </w:p>
     <w:p>
@@ -948,17 +1033,17 @@
         <w:jc w:val="both"/>
         <w:rPr>
           <w:rFonts w:ascii="Verdana" w:hAnsi="Verdana"/>
-          <w:b w:val="1"/>
-          <w:bCs w:val="1"/>
-          <w:sz w:val="18"/>
-          <w:szCs w:val="18"/>
-        </w:rPr>
-      </w:pPr>
-      <w:r>
-        <w:rPr>
-          <w:rFonts w:ascii="Verdana" w:hAnsi="Verdana"/>
-          <w:b w:val="1"/>
-          <w:bCs w:val="1"/>
+          <w:b/>
+          <w:bCs/>
+          <w:sz w:val="18"/>
+          <w:szCs w:val="18"/>
+        </w:rPr>
+      </w:pPr>
+      <w:r>
+        <w:rPr>
+          <w:rFonts w:ascii="Verdana" w:hAnsi="Verdana"/>
+          <w:b/>
+          <w:bCs/>
           <w:sz w:val="18"/>
           <w:szCs w:val="18"/>
         </w:rPr>
@@ -967,26 +1052,62 @@
     </w:p>
     <w:p>
       <w:pPr>
-        <w:pStyle w:val="Normal"/>
-        <w:jc w:val="both"/>
-        <w:rPr>
-          <w:rFonts w:ascii="Verdana" w:hAnsi="Verdana"/>
-          <w:sz w:val="18"/>
-          <w:szCs w:val="18"/>
-        </w:rPr>
-      </w:pPr>
-    </w:p>
-    <w:p>
-      <w:pPr>
-        <w:jc w:val="both"/>
-      </w:pPr>
-      <w:r>
-        <w:rPr>
-          <w:rFonts w:ascii="Verdana" w:hAnsi="Verdana"/>
-          <w:sz w:val="18"/>
-          <w:szCs w:val="18"/>
-        </w:rPr>
-        <w:t xml:space="preserve">To enhance the security of the upper method, MFA is integrated, including an extra submission of an individual external information, such as One-Time </w:t>
+        <w:jc w:val="both"/>
+        <w:rPr>
+          <w:rFonts w:ascii="Verdana" w:hAnsi="Verdana"/>
+          <w:sz w:val="18"/>
+          <w:szCs w:val="18"/>
+        </w:rPr>
+      </w:pPr>
+    </w:p>
+    <w:p>
+      <w:pPr>
+        <w:jc w:val="both"/>
+      </w:pPr>
+      <w:r>
+        <w:rPr>
+          <w:rFonts w:ascii="Verdana" w:hAnsi="Verdana"/>
+          <w:sz w:val="18"/>
+          <w:szCs w:val="18"/>
+        </w:rPr>
+        <w:lastRenderedPageBreak/>
+        <w:t xml:space="preserve">To enhance the security of the upper method, MFA is integrated, including </w:t>
+      </w:r>
+      <w:proofErr w:type="gramStart"/>
+      <w:r>
+        <w:rPr>
+          <w:rFonts w:ascii="Verdana" w:hAnsi="Verdana"/>
+          <w:sz w:val="18"/>
+          <w:szCs w:val="18"/>
+        </w:rPr>
+        <w:t>an extra</w:t>
+      </w:r>
+      <w:proofErr w:type="gramEnd"/>
+      <w:r>
+        <w:rPr>
+          <w:rFonts w:ascii="Verdana" w:hAnsi="Verdana"/>
+          <w:sz w:val="18"/>
+          <w:szCs w:val="18"/>
+        </w:rPr>
+        <w:t xml:space="preserve"> submission of </w:t>
+      </w:r>
+      <w:proofErr w:type="gramStart"/>
+      <w:r>
+        <w:rPr>
+          <w:rFonts w:ascii="Verdana" w:hAnsi="Verdana"/>
+          <w:sz w:val="18"/>
+          <w:szCs w:val="18"/>
+        </w:rPr>
+        <w:t>an individual</w:t>
+      </w:r>
+      <w:proofErr w:type="gramEnd"/>
+      <w:r>
+        <w:rPr>
+          <w:rFonts w:ascii="Verdana" w:hAnsi="Verdana"/>
+          <w:sz w:val="18"/>
+          <w:szCs w:val="18"/>
+        </w:rPr>
+        <w:t xml:space="preserve"> external information, such as One-Time </w:t>
       </w:r>
       <w:r>
         <w:rPr>
@@ -1002,23 +1123,7 @@
           <w:sz w:val="18"/>
           <w:szCs w:val="18"/>
         </w:rPr>
-        <w:t xml:space="preserve">just asking for what you know (password), this approach requires the users to </w:t>
-      </w:r>
-      <w:r>
-        <w:rPr>
-          <w:rFonts w:ascii="Verdana" w:hAnsi="Verdana"/>
-          <w:sz w:val="18"/>
-          <w:szCs w:val="18"/>
-        </w:rPr>
-        <w:t>submit</w:t>
-      </w:r>
-      <w:r>
-        <w:rPr>
-          <w:rFonts w:ascii="Verdana" w:hAnsi="Verdana"/>
-          <w:sz w:val="18"/>
-          <w:szCs w:val="18"/>
-        </w:rPr>
-        <w:t xml:space="preserve"> something they have as well, which might be the OTP sent to their </w:t>
+        <w:t xml:space="preserve">just asking for what you know (password), this approach requires the users to submit something they have as well, which might be the OTP sent to their </w:t>
       </w:r>
       <w:r>
         <w:rPr>
@@ -1073,66 +1178,68 @@
           <w:sz w:val="18"/>
           <w:szCs w:val="18"/>
         </w:rPr>
-        <w:t>a TOTOP generated by Microsoft Authenticator on my mobile device. Under the hood, Microsoft Entra ID handles the authentication process from verify</w:t>
-      </w:r>
-      <w:r>
-        <w:rPr>
-          <w:rFonts w:ascii="Verdana" w:hAnsi="Verdana"/>
-          <w:sz w:val="18"/>
-          <w:szCs w:val="18"/>
-        </w:rPr>
-        <w:t xml:space="preserve">ing my identity to </w:t>
-      </w:r>
-      <w:r>
-        <w:rPr>
-          <w:rFonts w:ascii="Verdana" w:hAnsi="Verdana"/>
-          <w:sz w:val="18"/>
-          <w:szCs w:val="18"/>
-        </w:rPr>
-        <w:t>the MFA</w:t>
-      </w:r>
-      <w:r>
-        <w:rPr>
-          <w:rFonts w:ascii="Verdana" w:hAnsi="Verdana"/>
-          <w:sz w:val="18"/>
-          <w:szCs w:val="18"/>
-        </w:rPr>
-        <w:t xml:space="preserve"> pipeline.</w:t>
-      </w:r>
-    </w:p>
-    <w:p>
-      <w:pPr>
-        <w:jc w:val="both"/>
-        <w:rPr>
-          <w:rFonts w:ascii="Verdana" w:hAnsi="Verdana"/>
-          <w:sz w:val="18"/>
-          <w:szCs w:val="18"/>
-        </w:rPr>
-      </w:pPr>
-    </w:p>
-    <w:p>
-      <w:pPr>
-        <w:pStyle w:val="Normal"/>
-        <w:jc w:val="both"/>
-      </w:pPr>
-      <w:r>
+        <w:t>a TOTP generated by Microsoft Authenticator on my mobile device. Under the hood, Microsoft Entra ID handles the authentication process from verify</w:t>
+      </w:r>
+      <w:r>
+        <w:rPr>
+          <w:rFonts w:ascii="Verdana" w:hAnsi="Verdana"/>
+          <w:sz w:val="18"/>
+          <w:szCs w:val="18"/>
+        </w:rPr>
+        <w:t>ing my identity to the MFA pipeline</w:t>
+      </w:r>
+      <w:r>
+        <w:rPr>
+          <w:rFonts w:ascii="Verdana" w:hAnsi="Verdana"/>
+          <w:sz w:val="18"/>
+          <w:szCs w:val="18"/>
+        </w:rPr>
+        <w:t xml:space="preserve"> (Microsoft, 2026a)</w:t>
+      </w:r>
+      <w:r>
+        <w:rPr>
+          <w:rFonts w:ascii="Verdana" w:hAnsi="Verdana"/>
+          <w:sz w:val="18"/>
+          <w:szCs w:val="18"/>
+        </w:rPr>
+        <w:t>.</w:t>
+      </w:r>
+    </w:p>
+    <w:p>
+      <w:pPr>
+        <w:jc w:val="both"/>
+        <w:rPr>
+          <w:rFonts w:ascii="Verdana" w:hAnsi="Verdana"/>
+          <w:sz w:val="18"/>
+          <w:szCs w:val="18"/>
+        </w:rPr>
+      </w:pPr>
+    </w:p>
+    <w:p>
+      <w:pPr>
+        <w:jc w:val="both"/>
+      </w:pPr>
+      <w:r>
+        <w:rPr>
+          <w:noProof/>
+        </w:rPr>
         <w:drawing>
-          <wp:inline wp14:editId="0271F5AE" wp14:anchorId="2804FA75">
-            <wp:extent cx="1534015" cy="1425914"/>
-            <wp:effectExtent l="0" t="0" r="0" b="0"/>
+          <wp:inline distT="0" distB="0" distL="0" distR="0" wp14:anchorId="2804FA75" wp14:editId="2B26016D">
+            <wp:extent cx="1470676" cy="1367039"/>
+            <wp:effectExtent l="0" t="0" r="0" b="5080"/>
             <wp:docPr id="14488667" name="drawing"/>
             <wp:cNvGraphicFramePr>
-              <a:graphicFrameLocks noChangeAspect="1"/>
+              <a:graphicFrameLocks xmlns:a="http://schemas.openxmlformats.org/drawingml/2006/main" noChangeAspect="1"/>
             </wp:cNvGraphicFramePr>
-            <a:graphic>
-              <a:graphicData xmlns:a="http://schemas.openxmlformats.org/drawingml/2006/main" uri="http://schemas.openxmlformats.org/drawingml/2006/picture">
+            <a:graphic xmlns:a="http://schemas.openxmlformats.org/drawingml/2006/main">
+              <a:graphicData uri="http://schemas.openxmlformats.org/drawingml/2006/picture">
                 <pic:pic xmlns:pic="http://schemas.openxmlformats.org/drawingml/2006/picture">
                   <pic:nvPicPr>
                     <pic:cNvPr id="14488667" name="Picture 14488667"/>
                     <pic:cNvPicPr/>
                   </pic:nvPicPr>
                   <pic:blipFill>
-                    <a:blip xmlns:r="http://schemas.openxmlformats.org/officeDocument/2006/relationships" r:embed="rId101340879">
+                    <a:blip r:embed="rId12">
                       <a:extLst>
                         <a:ext uri="{28A0092B-C50C-407E-A947-70E740481C1C}">
                           <a14:useLocalDpi xmlns:a14="http://schemas.microsoft.com/office/drawing/2010/main"/>
@@ -1144,9 +1251,9 @@
                     </a:stretch>
                   </pic:blipFill>
                   <pic:spPr>
-                    <a:xfrm rot="0">
+                    <a:xfrm>
                       <a:off x="0" y="0"/>
-                      <a:ext cx="1534015" cy="1425914"/>
+                      <a:ext cx="1476163" cy="1372139"/>
                     </a:xfrm>
                     <a:prstGeom prst="rect">
                       <a:avLst/>
@@ -1159,23 +1266,26 @@
         </w:drawing>
       </w:r>
       <w:r>
+        <w:rPr>
+          <w:noProof/>
+        </w:rPr>
         <w:drawing>
-          <wp:inline wp14:editId="75A6F5A8" wp14:anchorId="7B288502">
-            <wp:extent cx="1304925" cy="1489914"/>
+          <wp:inline distT="0" distB="0" distL="0" distR="0" wp14:anchorId="7B288502" wp14:editId="71481FDC">
+            <wp:extent cx="1204638" cy="1375410"/>
             <wp:effectExtent l="0" t="0" r="0" b="0"/>
             <wp:docPr id="2146495012" name="drawing"/>
             <wp:cNvGraphicFramePr>
-              <a:graphicFrameLocks noChangeAspect="1"/>
+              <a:graphicFrameLocks xmlns:a="http://schemas.openxmlformats.org/drawingml/2006/main" noChangeAspect="1"/>
             </wp:cNvGraphicFramePr>
-            <a:graphic>
-              <a:graphicData xmlns:a="http://schemas.openxmlformats.org/drawingml/2006/main" uri="http://schemas.openxmlformats.org/drawingml/2006/picture">
+            <a:graphic xmlns:a="http://schemas.openxmlformats.org/drawingml/2006/main">
+              <a:graphicData uri="http://schemas.openxmlformats.org/drawingml/2006/picture">
                 <pic:pic xmlns:pic="http://schemas.openxmlformats.org/drawingml/2006/picture">
                   <pic:nvPicPr>
                     <pic:cNvPr id="2146495012" name="Picture 2146495012"/>
                     <pic:cNvPicPr/>
                   </pic:nvPicPr>
                   <pic:blipFill>
-                    <a:blip xmlns:r="http://schemas.openxmlformats.org/officeDocument/2006/relationships" r:embed="rId227031494">
+                    <a:blip r:embed="rId13">
                       <a:extLst>
                         <a:ext uri="{28A0092B-C50C-407E-A947-70E740481C1C}">
                           <a14:useLocalDpi xmlns:a14="http://schemas.microsoft.com/office/drawing/2010/main"/>
@@ -1187,9 +1297,9 @@
                     </a:stretch>
                   </pic:blipFill>
                   <pic:spPr>
-                    <a:xfrm rot="0">
+                    <a:xfrm>
                       <a:off x="0" y="0"/>
-                      <a:ext cx="1304925" cy="1489914"/>
+                      <a:ext cx="1208020" cy="1379272"/>
                     </a:xfrm>
                     <a:prstGeom prst="rect">
                       <a:avLst/>
@@ -1222,17 +1332,17 @@
         <w:jc w:val="both"/>
         <w:rPr>
           <w:rFonts w:ascii="Verdana" w:hAnsi="Verdana"/>
-          <w:b w:val="1"/>
-          <w:bCs w:val="1"/>
-          <w:sz w:val="18"/>
-          <w:szCs w:val="18"/>
-        </w:rPr>
-      </w:pPr>
-      <w:r>
-        <w:rPr>
-          <w:rFonts w:ascii="Verdana" w:hAnsi="Verdana"/>
-          <w:b w:val="1"/>
-          <w:bCs w:val="1"/>
+          <w:b/>
+          <w:bCs/>
+          <w:sz w:val="18"/>
+          <w:szCs w:val="18"/>
+        </w:rPr>
+      </w:pPr>
+      <w:r>
+        <w:rPr>
+          <w:rFonts w:ascii="Verdana" w:hAnsi="Verdana"/>
+          <w:b/>
+          <w:bCs/>
           <w:sz w:val="18"/>
           <w:szCs w:val="18"/>
         </w:rPr>
@@ -1267,55 +1377,81 @@
           <w:sz w:val="18"/>
           <w:szCs w:val="18"/>
         </w:rPr>
-        <w:t>ds or PIN. The key is stored in system file, keychain, or Trusted Platform Environ</w:t>
-      </w:r>
-      <w:r>
-        <w:rPr>
-          <w:rFonts w:ascii="Verdana" w:hAnsi="Verdana"/>
-          <w:sz w:val="18"/>
-          <w:szCs w:val="18"/>
-        </w:rPr>
-        <w:t xml:space="preserve">ment (TEE). As authenticating to a service, the local machine will require the user to </w:t>
-      </w:r>
-      <w:r>
-        <w:rPr>
-          <w:rFonts w:ascii="Verdana" w:hAnsi="Verdana"/>
-          <w:sz w:val="18"/>
-          <w:szCs w:val="18"/>
-        </w:rPr>
-        <w:t>submit</w:t>
-      </w:r>
-      <w:r>
-        <w:rPr>
-          <w:rFonts w:ascii="Verdana" w:hAnsi="Verdana"/>
-          <w:sz w:val="18"/>
-          <w:szCs w:val="18"/>
-        </w:rPr>
-        <w:t xml:space="preserve"> a password </w:t>
-      </w:r>
-      <w:r>
-        <w:rPr>
-          <w:rFonts w:ascii="Verdana" w:hAnsi="Verdana"/>
-          <w:sz w:val="18"/>
-          <w:szCs w:val="18"/>
-        </w:rPr>
-        <w:t xml:space="preserve">or biometric evidence (something the user is) to unlock the key. The key will be </w:t>
-      </w:r>
-      <w:r>
-        <w:rPr>
-          <w:rFonts w:ascii="Verdana" w:hAnsi="Verdana"/>
-          <w:sz w:val="18"/>
-          <w:szCs w:val="18"/>
-        </w:rPr>
-        <w:t>submitted</w:t>
-      </w:r>
-      <w:r>
-        <w:rPr>
-          <w:rFonts w:ascii="Verdana" w:hAnsi="Verdana"/>
-          <w:sz w:val="18"/>
-          <w:szCs w:val="18"/>
-        </w:rPr>
-        <w:t xml:space="preserve"> to the service as an authentication factor. </w:t>
+        <w:t xml:space="preserve">ds or PIN. The key is stored in system file, keychain, or Trusted </w:t>
+      </w:r>
+      <w:r>
+        <w:rPr>
+          <w:rFonts w:ascii="Verdana" w:hAnsi="Verdana"/>
+          <w:sz w:val="18"/>
+          <w:szCs w:val="18"/>
+        </w:rPr>
+        <w:t>Execution</w:t>
+      </w:r>
+      <w:r>
+        <w:rPr>
+          <w:rFonts w:ascii="Verdana" w:hAnsi="Verdana"/>
+          <w:sz w:val="18"/>
+          <w:szCs w:val="18"/>
+        </w:rPr>
+        <w:t xml:space="preserve"> Environ</w:t>
+      </w:r>
+      <w:r>
+        <w:rPr>
+          <w:rFonts w:ascii="Verdana" w:hAnsi="Verdana"/>
+          <w:sz w:val="18"/>
+          <w:szCs w:val="18"/>
+        </w:rPr>
+        <w:t xml:space="preserve">ment (TEE). As authenticating to a service, the local machine will require the user to submit a password </w:t>
+      </w:r>
+      <w:r>
+        <w:rPr>
+          <w:rFonts w:ascii="Verdana" w:hAnsi="Verdana"/>
+          <w:sz w:val="18"/>
+          <w:szCs w:val="18"/>
+        </w:rPr>
+        <w:t>or biometric evidence (something the user is) to unlock the key. The key will be submitted to the service as an authentication factor</w:t>
+      </w:r>
+      <w:r>
+        <w:rPr>
+          <w:rFonts w:ascii="Verdana" w:hAnsi="Verdana"/>
+          <w:sz w:val="18"/>
+          <w:szCs w:val="18"/>
+        </w:rPr>
+        <w:t xml:space="preserve"> </w:t>
+      </w:r>
+      <w:r>
+        <w:rPr>
+          <w:rFonts w:ascii="Verdana" w:hAnsi="Verdana"/>
+          <w:sz w:val="18"/>
+          <w:szCs w:val="18"/>
+        </w:rPr>
+        <w:t>(</w:t>
+      </w:r>
+      <w:proofErr w:type="spellStart"/>
+      <w:r>
+        <w:rPr>
+          <w:rFonts w:ascii="Verdana" w:hAnsi="Verdana"/>
+          <w:sz w:val="18"/>
+          <w:szCs w:val="18"/>
+        </w:rPr>
+        <w:t>Temoshok</w:t>
+      </w:r>
+      <w:proofErr w:type="spellEnd"/>
+      <w:r>
+        <w:rPr>
+          <w:rFonts w:ascii="Verdana" w:hAnsi="Verdana"/>
+          <w:sz w:val="18"/>
+          <w:szCs w:val="18"/>
+        </w:rPr>
+        <w:t xml:space="preserve"> et al., 2025)</w:t>
+      </w:r>
+      <w:r>
+        <w:rPr>
+          <w:rFonts w:ascii="Verdana" w:hAnsi="Verdana"/>
+          <w:sz w:val="18"/>
+          <w:szCs w:val="18"/>
+        </w:rPr>
+        <w:t xml:space="preserve">. </w:t>
       </w:r>
     </w:p>
     <w:p>
@@ -1370,15 +1506,7 @@
           <w:sz w:val="18"/>
           <w:szCs w:val="18"/>
         </w:rPr>
-        <w:t>WebAuth</w:t>
-      </w:r>
-      <w:r>
-        <w:rPr>
-          <w:rFonts w:ascii="Verdana" w:hAnsi="Verdana"/>
-          <w:sz w:val="18"/>
-          <w:szCs w:val="18"/>
-        </w:rPr>
-        <w:t xml:space="preserve"> API manages the local challenge (a cryptographic challenge </w:t>
+        <w:t xml:space="preserve">WebAuth API manages the local challenge (a cryptographic challenge </w:t>
       </w:r>
       <w:r>
         <w:rPr>
@@ -1426,82 +1554,34 @@
           <w:sz w:val="18"/>
           <w:szCs w:val="18"/>
         </w:rPr>
-        <w:t>submit</w:t>
-      </w:r>
-      <w:r>
-        <w:rPr>
-          <w:rFonts w:ascii="Verdana" w:hAnsi="Verdana"/>
-          <w:sz w:val="18"/>
-          <w:szCs w:val="18"/>
-        </w:rPr>
-        <w:t xml:space="preserve"> either my </w:t>
-      </w:r>
-      <w:r>
-        <w:rPr>
-          <w:rFonts w:ascii="Verdana" w:hAnsi="Verdana"/>
-          <w:sz w:val="18"/>
-          <w:szCs w:val="18"/>
-        </w:rPr>
-        <w:t>computer</w:t>
-      </w:r>
-      <w:r>
-        <w:rPr>
-          <w:rFonts w:ascii="Verdana" w:hAnsi="Verdana"/>
-          <w:sz w:val="18"/>
-          <w:szCs w:val="18"/>
-        </w:rPr>
-        <w:t xml:space="preserve"> password, or fingerprint. As I </w:t>
-      </w:r>
-      <w:r>
-        <w:rPr>
-          <w:rFonts w:ascii="Verdana" w:hAnsi="Verdana"/>
-          <w:sz w:val="18"/>
-          <w:szCs w:val="18"/>
-        </w:rPr>
-        <w:t>submit</w:t>
-      </w:r>
-      <w:r>
-        <w:rPr>
-          <w:rFonts w:ascii="Verdana" w:hAnsi="Verdana"/>
-          <w:sz w:val="18"/>
-          <w:szCs w:val="18"/>
-        </w:rPr>
-        <w:t xml:space="preserve"> one of them, the key is unlocked and the challenge is compromised. </w:t>
-      </w:r>
-    </w:p>
-    <w:p>
-      <w:pPr>
-        <w:jc w:val="both"/>
-        <w:rPr>
-          <w:rFonts w:ascii="Verdana" w:hAnsi="Verdana"/>
-          <w:sz w:val="18"/>
-          <w:szCs w:val="18"/>
-        </w:rPr>
-      </w:pPr>
-    </w:p>
-    <w:p>
-      <w:pPr>
-        <w:pStyle w:val="Normal"/>
-        <w:jc w:val="both"/>
-      </w:pPr>
-      <w:r>
+        <w:t xml:space="preserve">submit either my computer password, or fingerprint. As I submit one of them, the key is unlocked and the challenge is compromised. </w:t>
+      </w:r>
+    </w:p>
+    <w:p>
+      <w:pPr>
+        <w:jc w:val="both"/>
+      </w:pPr>
+      <w:r>
+        <w:rPr>
+          <w:noProof/>
+        </w:rPr>
         <w:drawing>
-          <wp:inline wp14:editId="515935F9" wp14:anchorId="1539E47E">
+          <wp:inline distT="0" distB="0" distL="0" distR="0" wp14:anchorId="1539E47E" wp14:editId="515935F9">
             <wp:extent cx="1799375" cy="676275"/>
             <wp:effectExtent l="0" t="0" r="0" b="0"/>
             <wp:docPr id="16094489" name="drawing"/>
             <wp:cNvGraphicFramePr>
-              <a:graphicFrameLocks noChangeAspect="1"/>
+              <a:graphicFrameLocks xmlns:a="http://schemas.openxmlformats.org/drawingml/2006/main" noChangeAspect="1"/>
             </wp:cNvGraphicFramePr>
-            <a:graphic>
-              <a:graphicData xmlns:a="http://schemas.openxmlformats.org/drawingml/2006/main" uri="http://schemas.openxmlformats.org/drawingml/2006/picture">
+            <a:graphic xmlns:a="http://schemas.openxmlformats.org/drawingml/2006/main">
+              <a:graphicData uri="http://schemas.openxmlformats.org/drawingml/2006/picture">
                 <pic:pic xmlns:pic="http://schemas.openxmlformats.org/drawingml/2006/picture">
                   <pic:nvPicPr>
                     <pic:cNvPr id="16094489" name="Picture 16094489"/>
                     <pic:cNvPicPr/>
                   </pic:nvPicPr>
                   <pic:blipFill>
-                    <a:blip xmlns:r="http://schemas.openxmlformats.org/officeDocument/2006/relationships" r:embed="rId1196809966">
+                    <a:blip r:embed="rId14">
                       <a:extLst>
                         <a:ext uri="{28A0092B-C50C-407E-A947-70E740481C1C}">
                           <a14:useLocalDpi xmlns:a14="http://schemas.microsoft.com/office/drawing/2010/main"/>
@@ -1513,7 +1593,7 @@
                     </a:stretch>
                   </pic:blipFill>
                   <pic:spPr>
-                    <a:xfrm rot="0">
+                    <a:xfrm>
                       <a:off x="0" y="0"/>
                       <a:ext cx="1799375" cy="676275"/>
                     </a:xfrm>
@@ -1528,23 +1608,26 @@
         </w:drawing>
       </w:r>
       <w:r>
+        <w:rPr>
+          <w:noProof/>
+        </w:rPr>
         <w:drawing>
-          <wp:inline wp14:editId="7300F304" wp14:anchorId="0BC7D62C">
+          <wp:inline distT="0" distB="0" distL="0" distR="0" wp14:anchorId="0BC7D62C" wp14:editId="7300F304">
             <wp:extent cx="838200" cy="921710"/>
             <wp:effectExtent l="0" t="0" r="0" b="0"/>
             <wp:docPr id="1446916395" name="drawing"/>
             <wp:cNvGraphicFramePr>
-              <a:graphicFrameLocks noChangeAspect="1"/>
+              <a:graphicFrameLocks xmlns:a="http://schemas.openxmlformats.org/drawingml/2006/main" noChangeAspect="1"/>
             </wp:cNvGraphicFramePr>
-            <a:graphic>
-              <a:graphicData xmlns:a="http://schemas.openxmlformats.org/drawingml/2006/main" uri="http://schemas.openxmlformats.org/drawingml/2006/picture">
+            <a:graphic xmlns:a="http://schemas.openxmlformats.org/drawingml/2006/main">
+              <a:graphicData uri="http://schemas.openxmlformats.org/drawingml/2006/picture">
                 <pic:pic xmlns:pic="http://schemas.openxmlformats.org/drawingml/2006/picture">
                   <pic:nvPicPr>
                     <pic:cNvPr id="1446916395" name="Picture 1446916395"/>
                     <pic:cNvPicPr/>
                   </pic:nvPicPr>
                   <pic:blipFill>
-                    <a:blip xmlns:r="http://schemas.openxmlformats.org/officeDocument/2006/relationships" r:embed="rId1361801743">
+                    <a:blip r:embed="rId15">
                       <a:extLst>
                         <a:ext uri="{28A0092B-C50C-407E-A947-70E740481C1C}">
                           <a14:useLocalDpi xmlns:a14="http://schemas.microsoft.com/office/drawing/2010/main"/>
@@ -1556,7 +1639,7 @@
                     </a:stretch>
                   </pic:blipFill>
                   <pic:spPr>
-                    <a:xfrm rot="0">
+                    <a:xfrm>
                       <a:off x="0" y="0"/>
                       <a:ext cx="838200" cy="921710"/>
                     </a:xfrm>
@@ -1684,7 +1767,6 @@
     </w:p>
     <w:p>
       <w:pPr>
-        <w:pStyle w:val="Normal"/>
         <w:jc w:val="both"/>
         <w:rPr>
           <w:rFonts w:ascii="Verdana" w:hAnsi="Verdana"/>
@@ -1696,68 +1778,82 @@
     </w:p>
     <w:p>
       <w:pPr>
-        <w:pStyle w:val="Normal"/>
-        <w:suppressLineNumbers w:val="0"/>
-        <w:bidi w:val="0"/>
-        <w:spacing w:before="0" w:beforeAutospacing="off" w:after="0" w:afterAutospacing="off" w:line="259" w:lineRule="auto"/>
-        <w:ind w:left="0" w:right="0"/>
-        <w:jc w:val="both"/>
-      </w:pPr>
-      <w:r>
-        <w:rPr>
-          <w:rFonts w:ascii="Verdana" w:hAnsi="Verdana"/>
-          <w:sz w:val="18"/>
-          <w:szCs w:val="18"/>
-        </w:rPr>
-        <w:t xml:space="preserve">This is one of the most secure systems by asking the user for something that they physically own. </w:t>
-      </w:r>
-      <w:r>
-        <w:rPr>
-          <w:rFonts w:ascii="Verdana" w:hAnsi="Verdana"/>
-          <w:sz w:val="18"/>
-          <w:szCs w:val="18"/>
-        </w:rPr>
-        <w:t xml:space="preserve">By addressing something at the physical level, </w:t>
-      </w:r>
-      <w:r>
-        <w:rPr>
-          <w:rFonts w:ascii="Verdana" w:hAnsi="Verdana"/>
-          <w:sz w:val="18"/>
-          <w:szCs w:val="18"/>
-        </w:rPr>
-        <w:t>there</w:t>
-      </w:r>
-      <w:r>
-        <w:rPr>
-          <w:rFonts w:ascii="Verdana" w:hAnsi="Verdana"/>
-          <w:sz w:val="18"/>
-          <w:szCs w:val="18"/>
-        </w:rPr>
-        <w:t xml:space="preserve"> are </w:t>
-      </w:r>
-      <w:r>
-        <w:rPr>
-          <w:rFonts w:ascii="Verdana" w:hAnsi="Verdana"/>
-          <w:sz w:val="18"/>
-          <w:szCs w:val="18"/>
-        </w:rPr>
-        <w:t>not many</w:t>
-      </w:r>
-      <w:r>
-        <w:rPr>
-          <w:rFonts w:ascii="Verdana" w:hAnsi="Verdana"/>
-          <w:sz w:val="18"/>
-          <w:szCs w:val="18"/>
-        </w:rPr>
-        <w:t xml:space="preserve"> options for advisories to compromise the system, other than stealing or robbing the physical device. Instead of storing the encryp</w:t>
-      </w:r>
-      <w:r>
-        <w:rPr>
-          <w:rFonts w:ascii="Verdana" w:hAnsi="Verdana"/>
-          <w:sz w:val="18"/>
-          <w:szCs w:val="18"/>
-        </w:rPr>
-        <w:t xml:space="preserve">ted key on the local system via a software implementation, this system </w:t>
+        <w:spacing w:line="259" w:lineRule="auto"/>
+        <w:jc w:val="both"/>
+      </w:pPr>
+      <w:r>
+        <w:rPr>
+          <w:rFonts w:ascii="Verdana" w:hAnsi="Verdana"/>
+          <w:sz w:val="18"/>
+          <w:szCs w:val="18"/>
+        </w:rPr>
+        <w:t xml:space="preserve">This is one of the most secure systems by asking the user for something that they physically own. By addressing something at the physical level, </w:t>
+      </w:r>
+      <w:r>
+        <w:rPr>
+          <w:rFonts w:ascii="Verdana" w:hAnsi="Verdana"/>
+          <w:sz w:val="18"/>
+          <w:szCs w:val="18"/>
+        </w:rPr>
+        <w:t xml:space="preserve">there are not many options for </w:t>
+      </w:r>
+      <w:r>
+        <w:rPr>
+          <w:rFonts w:ascii="Verdana" w:hAnsi="Verdana"/>
+          <w:sz w:val="18"/>
+          <w:szCs w:val="18"/>
+        </w:rPr>
+        <w:t>adv</w:t>
+      </w:r>
+      <w:r>
+        <w:rPr>
+          <w:rFonts w:ascii="Verdana" w:hAnsi="Verdana"/>
+          <w:sz w:val="18"/>
+          <w:szCs w:val="18"/>
+        </w:rPr>
+        <w:t>er</w:t>
+      </w:r>
+      <w:r>
+        <w:rPr>
+          <w:rFonts w:ascii="Verdana" w:hAnsi="Verdana"/>
+          <w:sz w:val="18"/>
+          <w:szCs w:val="18"/>
+        </w:rPr>
+        <w:t>saries</w:t>
+      </w:r>
+      <w:r>
+        <w:rPr>
+          <w:rFonts w:ascii="Verdana" w:hAnsi="Verdana"/>
+          <w:sz w:val="18"/>
+          <w:szCs w:val="18"/>
+        </w:rPr>
+        <w:t xml:space="preserve"> to compromise the system, other than stealing or robbing the physical device. Instead of storing the encryp</w:t>
+      </w:r>
+      <w:r>
+        <w:rPr>
+          <w:rFonts w:ascii="Verdana" w:hAnsi="Verdana"/>
+          <w:sz w:val="18"/>
+          <w:szCs w:val="18"/>
+        </w:rPr>
+        <w:t xml:space="preserve">ted key on the local system via </w:t>
+      </w:r>
+      <w:proofErr w:type="gramStart"/>
+      <w:r>
+        <w:rPr>
+          <w:rFonts w:ascii="Verdana" w:hAnsi="Verdana"/>
+          <w:sz w:val="18"/>
+          <w:szCs w:val="18"/>
+        </w:rPr>
+        <w:t>a software</w:t>
+      </w:r>
+      <w:proofErr w:type="gramEnd"/>
+      <w:r>
+        <w:rPr>
+          <w:rFonts w:ascii="Verdana" w:hAnsi="Verdana"/>
+          <w:sz w:val="18"/>
+          <w:szCs w:val="18"/>
+        </w:rPr>
+        <w:t xml:space="preserve"> implementation, this system </w:t>
       </w:r>
       <w:r>
         <w:rPr>
@@ -1813,56 +1909,124 @@
           <w:sz w:val="18"/>
           <w:szCs w:val="18"/>
         </w:rPr>
-        <w:t xml:space="preserve"> or USB tokens.</w:t>
-      </w:r>
-    </w:p>
-    <w:p>
-      <w:pPr>
-        <w:pStyle w:val="Normal"/>
-        <w:suppressLineNumbers w:val="0"/>
-        <w:bidi w:val="0"/>
-        <w:spacing w:before="0" w:beforeAutospacing="off" w:after="0" w:afterAutospacing="off" w:line="259" w:lineRule="auto"/>
-        <w:ind w:left="0" w:right="0"/>
-        <w:jc w:val="both"/>
-        <w:rPr>
-          <w:rFonts w:ascii="Verdana" w:hAnsi="Verdana"/>
-          <w:sz w:val="18"/>
-          <w:szCs w:val="18"/>
-        </w:rPr>
-      </w:pPr>
-    </w:p>
-    <w:p>
-      <w:pPr>
-        <w:pStyle w:val="Normal"/>
-        <w:suppressLineNumbers w:val="0"/>
-        <w:bidi w:val="0"/>
-        <w:spacing w:before="0" w:beforeAutospacing="off" w:after="0" w:afterAutospacing="off" w:line="259" w:lineRule="auto"/>
-        <w:ind w:left="0" w:right="0"/>
-        <w:jc w:val="both"/>
-      </w:pPr>
-      <w:r>
-        <w:rPr>
-          <w:rFonts w:ascii="Verdana" w:hAnsi="Verdana"/>
-          <w:sz w:val="18"/>
-          <w:szCs w:val="18"/>
-        </w:rPr>
-        <w:t xml:space="preserve">Google </w:t>
-      </w:r>
-      <w:r>
-        <w:rPr>
-          <w:rFonts w:ascii="Verdana" w:hAnsi="Verdana"/>
-          <w:sz w:val="18"/>
-          <w:szCs w:val="18"/>
-        </w:rPr>
-        <w:t>provides</w:t>
-      </w:r>
-      <w:r>
-        <w:rPr>
-          <w:rFonts w:ascii="Verdana" w:hAnsi="Verdana"/>
-          <w:sz w:val="18"/>
-          <w:szCs w:val="18"/>
-        </w:rPr>
-        <w:t xml:space="preserve"> an example of this method through its Titan Security Key, which is a USB device that supports FIDO2 and U2F protocols. </w:t>
+        <w:t xml:space="preserve"> or USB tokens</w:t>
+      </w:r>
+      <w:r>
+        <w:rPr>
+          <w:rFonts w:ascii="Verdana" w:hAnsi="Verdana"/>
+          <w:sz w:val="18"/>
+          <w:szCs w:val="18"/>
+        </w:rPr>
+        <w:t xml:space="preserve"> </w:t>
+      </w:r>
+      <w:r>
+        <w:rPr>
+          <w:rFonts w:ascii="Verdana" w:hAnsi="Verdana"/>
+          <w:sz w:val="18"/>
+          <w:szCs w:val="18"/>
+        </w:rPr>
+        <w:t>(</w:t>
+      </w:r>
+      <w:proofErr w:type="spellStart"/>
+      <w:r>
+        <w:rPr>
+          <w:rFonts w:ascii="Verdana" w:hAnsi="Verdana"/>
+          <w:sz w:val="18"/>
+          <w:szCs w:val="18"/>
+        </w:rPr>
+        <w:t>Temoshok</w:t>
+      </w:r>
+      <w:proofErr w:type="spellEnd"/>
+      <w:r>
+        <w:rPr>
+          <w:rFonts w:ascii="Verdana" w:hAnsi="Verdana"/>
+          <w:sz w:val="18"/>
+          <w:szCs w:val="18"/>
+        </w:rPr>
+        <w:t xml:space="preserve"> et al., 2025)</w:t>
+      </w:r>
+      <w:r>
+        <w:rPr>
+          <w:rFonts w:ascii="Verdana" w:hAnsi="Verdana"/>
+          <w:sz w:val="18"/>
+          <w:szCs w:val="18"/>
+        </w:rPr>
+        <w:t>.</w:t>
+      </w:r>
+    </w:p>
+    <w:p>
+      <w:pPr>
+        <w:spacing w:line="259" w:lineRule="auto"/>
+        <w:jc w:val="both"/>
+        <w:rPr>
+          <w:rFonts w:ascii="Verdana" w:hAnsi="Verdana"/>
+          <w:sz w:val="18"/>
+          <w:szCs w:val="18"/>
+        </w:rPr>
+      </w:pPr>
+    </w:p>
+    <w:p>
+      <w:pPr>
+        <w:spacing w:line="259" w:lineRule="auto"/>
+        <w:jc w:val="both"/>
+      </w:pPr>
+      <w:r>
+        <w:rPr>
+          <w:rFonts w:ascii="Verdana" w:hAnsi="Verdana"/>
+          <w:sz w:val="18"/>
+          <w:szCs w:val="18"/>
+        </w:rPr>
+        <w:t>Google provides an example of this method through its Titan Security Key, which is a USB device that supports FIDO2 and U2F protocols</w:t>
+      </w:r>
+      <w:r>
+        <w:rPr>
+          <w:rFonts w:ascii="Verdana" w:hAnsi="Verdana"/>
+          <w:sz w:val="18"/>
+          <w:szCs w:val="18"/>
+        </w:rPr>
+        <w:t xml:space="preserve"> </w:t>
+      </w:r>
+      <w:r>
+        <w:rPr>
+          <w:rFonts w:ascii="Verdana" w:hAnsi="Verdana"/>
+          <w:sz w:val="18"/>
+          <w:szCs w:val="18"/>
+        </w:rPr>
+        <w:t>(Google</w:t>
+      </w:r>
+      <w:proofErr w:type="gramStart"/>
+      <w:r>
+        <w:rPr>
+          <w:rFonts w:ascii="Verdana" w:hAnsi="Verdana"/>
+          <w:sz w:val="18"/>
+          <w:szCs w:val="18"/>
+        </w:rPr>
+        <w:t>, n.d</w:t>
+      </w:r>
+      <w:proofErr w:type="gramEnd"/>
+      <w:r>
+        <w:rPr>
+          <w:rFonts w:ascii="Verdana" w:hAnsi="Verdana"/>
+          <w:sz w:val="18"/>
+          <w:szCs w:val="18"/>
+        </w:rPr>
+        <w:t>.</w:t>
+      </w:r>
+      <w:r>
+        <w:rPr>
+          <w:rFonts w:ascii="Verdana" w:hAnsi="Verdana"/>
+          <w:sz w:val="18"/>
+          <w:szCs w:val="18"/>
+        </w:rPr>
+        <w:t>)</w:t>
+      </w:r>
+      <w:r>
+        <w:rPr>
+          <w:rFonts w:ascii="Verdana" w:hAnsi="Verdana"/>
+          <w:sz w:val="18"/>
+          <w:szCs w:val="18"/>
+        </w:rPr>
+        <w:t xml:space="preserve">. </w:t>
       </w:r>
       <w:r>
         <w:rPr>
@@ -1894,23 +2058,23 @@
           <w:sz w:val="18"/>
           <w:szCs w:val="18"/>
         </w:rPr>
-        <w:t xml:space="preserve">the Titan Secure Key, </w:t>
-      </w:r>
-      <w:r>
-        <w:rPr>
-          <w:rFonts w:ascii="Verdana" w:hAnsi="Verdana"/>
-          <w:sz w:val="18"/>
-          <w:szCs w:val="18"/>
-        </w:rPr>
-        <w:t>containing</w:t>
-      </w:r>
-      <w:r>
-        <w:rPr>
-          <w:rFonts w:ascii="Verdana" w:hAnsi="Verdana"/>
-          <w:sz w:val="18"/>
-          <w:szCs w:val="18"/>
-        </w:rPr>
-        <w:t xml:space="preserve"> my </w:t>
+        <w:t>the Titan Secur</w:t>
+      </w:r>
+      <w:r>
+        <w:rPr>
+          <w:rFonts w:ascii="Verdana" w:hAnsi="Verdana"/>
+          <w:sz w:val="18"/>
+          <w:szCs w:val="18"/>
+        </w:rPr>
+        <w:t>ity</w:t>
+      </w:r>
+      <w:r>
+        <w:rPr>
+          <w:rFonts w:ascii="Verdana" w:hAnsi="Verdana"/>
+          <w:sz w:val="18"/>
+          <w:szCs w:val="18"/>
+        </w:rPr>
+        <w:t xml:space="preserve"> Key, containing my </w:t>
       </w:r>
       <w:r>
         <w:rPr>
@@ -1926,23 +2090,7 @@
           <w:sz w:val="18"/>
           <w:szCs w:val="18"/>
         </w:rPr>
-        <w:t xml:space="preserve">As </w:t>
-      </w:r>
-      <w:r>
-        <w:rPr>
-          <w:rFonts w:ascii="Verdana" w:hAnsi="Verdana"/>
-          <w:sz w:val="18"/>
-          <w:szCs w:val="18"/>
-        </w:rPr>
-        <w:t>submitting</w:t>
-      </w:r>
-      <w:r>
-        <w:rPr>
-          <w:rFonts w:ascii="Verdana" w:hAnsi="Verdana"/>
-          <w:sz w:val="18"/>
-          <w:szCs w:val="18"/>
-        </w:rPr>
-        <w:t xml:space="preserve"> this key, I am authenticated by Google Identity to have access to the account I am </w:t>
+        <w:t xml:space="preserve">As submitting this key, I am authenticated by Google Identity to have access to the account I am </w:t>
       </w:r>
       <w:r>
         <w:rPr>
@@ -1955,45 +2103,41 @@
     </w:p>
     <w:p>
       <w:pPr>
-        <w:pStyle w:val="Normal"/>
-        <w:suppressLineNumbers w:val="0"/>
-        <w:bidi w:val="0"/>
-        <w:spacing w:before="0" w:beforeAutospacing="off" w:after="0" w:afterAutospacing="off" w:line="259" w:lineRule="auto"/>
-        <w:ind w:left="0" w:right="0"/>
-        <w:jc w:val="both"/>
-        <w:rPr>
-          <w:rFonts w:ascii="Verdana" w:hAnsi="Verdana"/>
-          <w:sz w:val="18"/>
-          <w:szCs w:val="18"/>
-        </w:rPr>
-      </w:pPr>
-    </w:p>
-    <w:p>
-      <w:pPr>
-        <w:pStyle w:val="Normal"/>
-        <w:bidi w:val="0"/>
-        <w:spacing w:before="0" w:beforeAutospacing="off" w:after="0" w:afterAutospacing="off" w:line="259" w:lineRule="auto"/>
-        <w:ind w:left="0" w:right="0"/>
-        <w:jc w:val="both"/>
-      </w:pPr>
-      <w:r>
+        <w:spacing w:line="259" w:lineRule="auto"/>
+        <w:jc w:val="both"/>
+        <w:rPr>
+          <w:rFonts w:ascii="Verdana" w:hAnsi="Verdana"/>
+          <w:sz w:val="18"/>
+          <w:szCs w:val="18"/>
+        </w:rPr>
+      </w:pPr>
+    </w:p>
+    <w:p>
+      <w:pPr>
+        <w:spacing w:line="259" w:lineRule="auto"/>
+        <w:jc w:val="both"/>
+      </w:pPr>
+      <w:r>
+        <w:rPr>
+          <w:noProof/>
+        </w:rPr>
         <w:drawing>
-          <wp:inline wp14:editId="0CCFB6A9" wp14:anchorId="713CDA04">
+          <wp:inline distT="0" distB="0" distL="0" distR="0" wp14:anchorId="713CDA04" wp14:editId="0CCFB6A9">
             <wp:extent cx="1446482" cy="1082434"/>
             <wp:effectExtent l="0" t="0" r="0" b="0"/>
             <wp:docPr id="240243862" name="drawing"/>
             <wp:cNvGraphicFramePr>
-              <a:graphicFrameLocks noChangeAspect="1"/>
+              <a:graphicFrameLocks xmlns:a="http://schemas.openxmlformats.org/drawingml/2006/main" noChangeAspect="1"/>
             </wp:cNvGraphicFramePr>
-            <a:graphic>
-              <a:graphicData xmlns:a="http://schemas.openxmlformats.org/drawingml/2006/main" uri="http://schemas.openxmlformats.org/drawingml/2006/picture">
+            <a:graphic xmlns:a="http://schemas.openxmlformats.org/drawingml/2006/main">
+              <a:graphicData uri="http://schemas.openxmlformats.org/drawingml/2006/picture">
                 <pic:pic xmlns:pic="http://schemas.openxmlformats.org/drawingml/2006/picture">
                   <pic:nvPicPr>
                     <pic:cNvPr id="240243862" name="Picture 240243862"/>
                     <pic:cNvPicPr/>
                   </pic:nvPicPr>
                   <pic:blipFill>
-                    <a:blip xmlns:r="http://schemas.openxmlformats.org/officeDocument/2006/relationships" r:embed="rId1968595548">
+                    <a:blip r:embed="rId16">
                       <a:extLst>
                         <a:ext uri="{28A0092B-C50C-407E-A947-70E740481C1C}">
                           <a14:useLocalDpi xmlns:a14="http://schemas.microsoft.com/office/drawing/2010/main"/>
@@ -2005,7 +2149,7 @@
                     </a:stretch>
                   </pic:blipFill>
                   <pic:spPr>
-                    <a:xfrm rot="0">
+                    <a:xfrm>
                       <a:off x="0" y="0"/>
                       <a:ext cx="1446482" cy="1082434"/>
                     </a:xfrm>
@@ -2020,23 +2164,26 @@
         </w:drawing>
       </w:r>
       <w:r>
+        <w:rPr>
+          <w:noProof/>
+        </w:rPr>
         <w:drawing>
-          <wp:inline wp14:editId="0F977DD5" wp14:anchorId="54D62D5A">
+          <wp:inline distT="0" distB="0" distL="0" distR="0" wp14:anchorId="54D62D5A" wp14:editId="0F977DD5">
             <wp:extent cx="1170173" cy="1095564"/>
             <wp:effectExtent l="0" t="0" r="0" b="0"/>
             <wp:docPr id="457532341" name="drawing"/>
             <wp:cNvGraphicFramePr>
-              <a:graphicFrameLocks noChangeAspect="1"/>
+              <a:graphicFrameLocks xmlns:a="http://schemas.openxmlformats.org/drawingml/2006/main" noChangeAspect="1"/>
             </wp:cNvGraphicFramePr>
-            <a:graphic>
-              <a:graphicData xmlns:a="http://schemas.openxmlformats.org/drawingml/2006/main" uri="http://schemas.openxmlformats.org/drawingml/2006/picture">
+            <a:graphic xmlns:a="http://schemas.openxmlformats.org/drawingml/2006/main">
+              <a:graphicData uri="http://schemas.openxmlformats.org/drawingml/2006/picture">
                 <pic:pic xmlns:pic="http://schemas.openxmlformats.org/drawingml/2006/picture">
                   <pic:nvPicPr>
                     <pic:cNvPr id="457532341" name="Picture 457532341"/>
                     <pic:cNvPicPr/>
                   </pic:nvPicPr>
                   <pic:blipFill>
-                    <a:blip xmlns:r="http://schemas.openxmlformats.org/officeDocument/2006/relationships" r:embed="rId322421264">
+                    <a:blip r:embed="rId17">
                       <a:extLst>
                         <a:ext uri="{28A0092B-C50C-407E-A947-70E740481C1C}">
                           <a14:useLocalDpi xmlns:a14="http://schemas.microsoft.com/office/drawing/2010/main"/>
@@ -2048,7 +2195,7 @@
                     </a:stretch>
                   </pic:blipFill>
                   <pic:spPr>
-                    <a:xfrm rot="0">
+                    <a:xfrm>
                       <a:off x="0" y="0"/>
                       <a:ext cx="1170173" cy="1095564"/>
                     </a:xfrm>
@@ -2083,26 +2230,22 @@
         <w:jc w:val="both"/>
         <w:rPr>
           <w:rFonts w:ascii="Verdana" w:hAnsi="Verdana"/>
-          <w:b w:val="1"/>
-          <w:bCs w:val="1"/>
-          <w:sz w:val="18"/>
-          <w:szCs w:val="18"/>
-        </w:rPr>
-      </w:pPr>
-      <w:r>
-        <w:rPr>
-          <w:rFonts w:ascii="Verdana" w:hAnsi="Verdana"/>
-          <w:b w:val="1"/>
-          <w:bCs w:val="1"/>
+          <w:b/>
+          <w:bCs/>
+          <w:sz w:val="18"/>
+          <w:szCs w:val="18"/>
+        </w:rPr>
+      </w:pPr>
+      <w:r>
+        <w:rPr>
+          <w:rFonts w:ascii="Verdana" w:hAnsi="Verdana"/>
+          <w:b/>
+          <w:bCs/>
           <w:sz w:val="18"/>
           <w:szCs w:val="18"/>
         </w:rPr>
         <w:t>Federation and Assertions</w:t>
       </w:r>
-      <w:proofErr w:type="gramStart"/>
-      <w:proofErr w:type="gramEnd"/>
-      <w:proofErr w:type="gramStart"/>
-      <w:proofErr w:type="gramEnd"/>
     </w:p>
     <w:p>
       <w:pPr>
@@ -2132,23 +2275,7 @@
           <w:sz w:val="18"/>
           <w:szCs w:val="18"/>
         </w:rPr>
-        <w:t xml:space="preserve"> and Assertions method is now widely </w:t>
-      </w:r>
-      <w:r>
-        <w:rPr>
-          <w:rFonts w:ascii="Verdana" w:hAnsi="Verdana"/>
-          <w:sz w:val="18"/>
-          <w:szCs w:val="18"/>
-        </w:rPr>
-        <w:t>used, since</w:t>
-      </w:r>
-      <w:r>
-        <w:rPr>
-          <w:rFonts w:ascii="Verdana" w:hAnsi="Verdana"/>
-          <w:sz w:val="18"/>
-          <w:szCs w:val="18"/>
-        </w:rPr>
-        <w:t xml:space="preserve"> it prevents the</w:t>
+        <w:t xml:space="preserve"> and Assertions method is now widely used, since it prevents the</w:t>
       </w:r>
       <w:r>
         <w:rPr>
@@ -2172,6 +2299,137 @@
           <w:sz w:val="18"/>
           <w:szCs w:val="18"/>
         </w:rPr>
+        <w:t xml:space="preserve">. Basically, the authentication process will be handled by a third-party </w:t>
+      </w:r>
+      <w:r>
+        <w:rPr>
+          <w:rFonts w:ascii="Verdana" w:hAnsi="Verdana"/>
+          <w:sz w:val="18"/>
+          <w:szCs w:val="18"/>
+        </w:rPr>
+        <w:t>entity, such as Google or Microsoft</w:t>
+      </w:r>
+      <w:r>
+        <w:rPr>
+          <w:rFonts w:ascii="Verdana" w:hAnsi="Verdana"/>
+          <w:sz w:val="18"/>
+          <w:szCs w:val="18"/>
+        </w:rPr>
+        <w:t xml:space="preserve"> </w:t>
+      </w:r>
+      <w:r>
+        <w:rPr>
+          <w:rFonts w:ascii="Verdana" w:hAnsi="Verdana"/>
+          <w:sz w:val="18"/>
+          <w:szCs w:val="18"/>
+        </w:rPr>
+        <w:t>(</w:t>
+      </w:r>
+      <w:proofErr w:type="spellStart"/>
+      <w:r>
+        <w:rPr>
+          <w:rFonts w:ascii="Verdana" w:hAnsi="Verdana"/>
+          <w:sz w:val="18"/>
+          <w:szCs w:val="18"/>
+        </w:rPr>
+        <w:t>Temoshok</w:t>
+      </w:r>
+      <w:proofErr w:type="spellEnd"/>
+      <w:r>
+        <w:rPr>
+          <w:rFonts w:ascii="Verdana" w:hAnsi="Verdana"/>
+          <w:sz w:val="18"/>
+          <w:szCs w:val="18"/>
+        </w:rPr>
+        <w:t xml:space="preserve"> et al., 2025)</w:t>
+      </w:r>
+      <w:r>
+        <w:rPr>
+          <w:rFonts w:ascii="Verdana" w:hAnsi="Verdana"/>
+          <w:sz w:val="18"/>
+          <w:szCs w:val="18"/>
+        </w:rPr>
+        <w:t>. By this definition, the security l</w:t>
+      </w:r>
+      <w:r>
+        <w:rPr>
+          <w:rFonts w:ascii="Verdana" w:hAnsi="Verdana"/>
+          <w:sz w:val="18"/>
+          <w:szCs w:val="18"/>
+        </w:rPr>
+        <w:t xml:space="preserve">evel can vary from AAL1 to AAL3, depending on the identity that handles authentication. </w:t>
+      </w:r>
+    </w:p>
+    <w:p>
+      <w:pPr>
+        <w:jc w:val="both"/>
+        <w:rPr>
+          <w:rFonts w:ascii="Verdana" w:hAnsi="Verdana"/>
+          <w:sz w:val="18"/>
+          <w:szCs w:val="18"/>
+        </w:rPr>
+      </w:pPr>
+    </w:p>
+    <w:p>
+      <w:pPr>
+        <w:spacing w:line="259" w:lineRule="auto"/>
+        <w:jc w:val="both"/>
+      </w:pPr>
+      <w:r>
+        <w:rPr>
+          <w:rFonts w:ascii="Verdana" w:hAnsi="Verdana"/>
+          <w:sz w:val="18"/>
+          <w:szCs w:val="18"/>
+        </w:rPr>
+        <w:t xml:space="preserve">An example </w:t>
+      </w:r>
+      <w:r>
+        <w:rPr>
+          <w:rFonts w:ascii="Verdana" w:hAnsi="Verdana"/>
+          <w:sz w:val="18"/>
+          <w:szCs w:val="18"/>
+        </w:rPr>
+        <w:t>of</w:t>
+      </w:r>
+      <w:r>
+        <w:rPr>
+          <w:rFonts w:ascii="Verdana" w:hAnsi="Verdana"/>
+          <w:sz w:val="18"/>
+          <w:szCs w:val="18"/>
+        </w:rPr>
+        <w:t xml:space="preserve"> this approach is the implementation of OpenID Connect (OIDC)/ OAuth 2.0 and Microsoft Entra ID for federated authentication to Brightspace course </w:t>
+      </w:r>
+      <w:r>
+        <w:rPr>
+          <w:rFonts w:ascii="Verdana" w:hAnsi="Verdana"/>
+          <w:sz w:val="18"/>
+          <w:szCs w:val="18"/>
+        </w:rPr>
+        <w:t>manager</w:t>
+      </w:r>
+      <w:r>
+        <w:rPr>
+          <w:rFonts w:ascii="Verdana" w:hAnsi="Verdana"/>
+          <w:sz w:val="18"/>
+          <w:szCs w:val="18"/>
+        </w:rPr>
+        <w:t xml:space="preserve"> </w:t>
+      </w:r>
+      <w:r>
+        <w:rPr>
+          <w:rFonts w:ascii="Verdana" w:hAnsi="Verdana"/>
+          <w:sz w:val="18"/>
+          <w:szCs w:val="18"/>
+        </w:rPr>
+        <w:lastRenderedPageBreak/>
+        <w:t>(D2L, 2026)</w:t>
+      </w:r>
+      <w:r>
+        <w:rPr>
+          <w:rFonts w:ascii="Verdana" w:hAnsi="Verdana"/>
+          <w:sz w:val="18"/>
+          <w:szCs w:val="18"/>
+        </w:rPr>
         <w:t xml:space="preserve">. </w:t>
       </w:r>
       <w:r>
@@ -2180,106 +2438,6 @@
           <w:sz w:val="18"/>
           <w:szCs w:val="18"/>
         </w:rPr>
-        <w:t>Basically, the</w:t>
-      </w:r>
-      <w:r>
-        <w:rPr>
-          <w:rFonts w:ascii="Verdana" w:hAnsi="Verdana"/>
-          <w:sz w:val="18"/>
-          <w:szCs w:val="18"/>
-        </w:rPr>
-        <w:t xml:space="preserve"> authentication process will be handled by a third-party </w:t>
-      </w:r>
-      <w:r>
-        <w:rPr>
-          <w:rFonts w:ascii="Verdana" w:hAnsi="Verdana"/>
-          <w:sz w:val="18"/>
-          <w:szCs w:val="18"/>
-        </w:rPr>
-        <w:t>entity, such as Google or Microsoft. By this definition, the security l</w:t>
-      </w:r>
-      <w:r>
-        <w:rPr>
-          <w:rFonts w:ascii="Verdana" w:hAnsi="Verdana"/>
-          <w:sz w:val="18"/>
-          <w:szCs w:val="18"/>
-        </w:rPr>
-        <w:t xml:space="preserve">evel can </w:t>
-      </w:r>
-      <w:r>
-        <w:rPr>
-          <w:rFonts w:ascii="Verdana" w:hAnsi="Verdana"/>
-          <w:sz w:val="18"/>
-          <w:szCs w:val="18"/>
-        </w:rPr>
-        <w:t>vary</w:t>
-      </w:r>
-      <w:r>
-        <w:rPr>
-          <w:rFonts w:ascii="Verdana" w:hAnsi="Verdana"/>
-          <w:sz w:val="18"/>
-          <w:szCs w:val="18"/>
-        </w:rPr>
-        <w:t xml:space="preserve"> from AAL1 to AAL3, depending on the identity that handles authentication. </w:t>
-      </w:r>
-    </w:p>
-    <w:p>
-      <w:pPr>
-        <w:jc w:val="both"/>
-        <w:rPr>
-          <w:rFonts w:ascii="Verdana" w:hAnsi="Verdana"/>
-          <w:sz w:val="18"/>
-          <w:szCs w:val="18"/>
-        </w:rPr>
-      </w:pPr>
-    </w:p>
-    <w:p>
-      <w:pPr>
-        <w:pStyle w:val="Normal"/>
-        <w:suppressLineNumbers w:val="0"/>
-        <w:bidi w:val="0"/>
-        <w:spacing w:before="0" w:beforeAutospacing="off" w:after="0" w:afterAutospacing="off" w:line="259" w:lineRule="auto"/>
-        <w:ind w:left="0" w:right="0"/>
-        <w:jc w:val="both"/>
-      </w:pPr>
-      <w:r>
-        <w:rPr>
-          <w:rFonts w:ascii="Verdana" w:hAnsi="Verdana"/>
-          <w:sz w:val="18"/>
-          <w:szCs w:val="18"/>
-        </w:rPr>
-        <w:t xml:space="preserve">An example </w:t>
-      </w:r>
-      <w:r>
-        <w:rPr>
-          <w:rFonts w:ascii="Verdana" w:hAnsi="Verdana"/>
-          <w:sz w:val="18"/>
-          <w:szCs w:val="18"/>
-        </w:rPr>
-        <w:t>of</w:t>
-      </w:r>
-      <w:r>
-        <w:rPr>
-          <w:rFonts w:ascii="Verdana" w:hAnsi="Verdana"/>
-          <w:sz w:val="18"/>
-          <w:szCs w:val="18"/>
-        </w:rPr>
-        <w:t xml:space="preserve"> this approach is the implementation of OpenID Connect (OIDC) / OAuth 2.0 and Microsoft Entra ID for federated authentication to Brightspace course </w:t>
-      </w:r>
-      <w:r>
-        <w:rPr>
-          <w:rFonts w:ascii="Verdana" w:hAnsi="Verdana"/>
-          <w:sz w:val="18"/>
-          <w:szCs w:val="18"/>
-        </w:rPr>
-        <w:t xml:space="preserve">manager. </w:t>
-      </w:r>
-      <w:r>
-        <w:rPr>
-          <w:rFonts w:ascii="Verdana" w:hAnsi="Verdana"/>
-          <w:sz w:val="18"/>
-          <w:szCs w:val="18"/>
-        </w:rPr>
         <w:t>As log</w:t>
       </w:r>
       <w:r>
@@ -2376,23 +2534,7 @@
           <w:sz w:val="18"/>
           <w:szCs w:val="18"/>
         </w:rPr>
-        <w:t xml:space="preserve">As </w:t>
-      </w:r>
-      <w:r>
-        <w:rPr>
-          <w:rFonts w:ascii="Verdana" w:hAnsi="Verdana"/>
-          <w:sz w:val="18"/>
-          <w:szCs w:val="18"/>
-        </w:rPr>
-        <w:t>submitting</w:t>
-      </w:r>
-      <w:r>
-        <w:rPr>
-          <w:rFonts w:ascii="Verdana" w:hAnsi="Verdana"/>
-          <w:sz w:val="18"/>
-          <w:szCs w:val="18"/>
-        </w:rPr>
-        <w:t xml:space="preserve"> everything correctly, I am now authenticated as the user linking to the Microsoft account </w:t>
+        <w:t xml:space="preserve">As submitting everything correctly, I am now authenticated as the user linking to the Microsoft account </w:t>
       </w:r>
       <w:r>
         <w:rPr>
@@ -2405,45 +2547,41 @@
     </w:p>
     <w:p>
       <w:pPr>
-        <w:pStyle w:val="Normal"/>
-        <w:suppressLineNumbers w:val="0"/>
-        <w:bidi w:val="0"/>
-        <w:spacing w:before="0" w:beforeAutospacing="off" w:after="0" w:afterAutospacing="off" w:line="259" w:lineRule="auto"/>
-        <w:ind w:left="0" w:right="0"/>
-        <w:jc w:val="both"/>
-        <w:rPr>
-          <w:rFonts w:ascii="Verdana" w:hAnsi="Verdana"/>
-          <w:sz w:val="18"/>
-          <w:szCs w:val="18"/>
-        </w:rPr>
-      </w:pPr>
-    </w:p>
-    <w:p>
-      <w:pPr>
-        <w:pStyle w:val="Normal"/>
-        <w:bidi w:val="0"/>
-        <w:spacing w:before="0" w:beforeAutospacing="off" w:after="0" w:afterAutospacing="off" w:line="259" w:lineRule="auto"/>
-        <w:ind w:left="0" w:right="0"/>
-        <w:jc w:val="both"/>
-      </w:pPr>
-      <w:r>
+        <w:spacing w:line="259" w:lineRule="auto"/>
+        <w:jc w:val="both"/>
+        <w:rPr>
+          <w:rFonts w:ascii="Verdana" w:hAnsi="Verdana"/>
+          <w:sz w:val="18"/>
+          <w:szCs w:val="18"/>
+        </w:rPr>
+      </w:pPr>
+    </w:p>
+    <w:p>
+      <w:pPr>
+        <w:spacing w:line="259" w:lineRule="auto"/>
+        <w:jc w:val="both"/>
+      </w:pPr>
+      <w:r>
+        <w:rPr>
+          <w:noProof/>
+        </w:rPr>
         <w:drawing>
-          <wp:inline wp14:editId="43BC7EE8" wp14:anchorId="6F1472D3">
+          <wp:inline distT="0" distB="0" distL="0" distR="0" wp14:anchorId="6F1472D3" wp14:editId="43BC7EE8">
             <wp:extent cx="2838450" cy="1685925"/>
             <wp:effectExtent l="0" t="0" r="0" b="0"/>
             <wp:docPr id="771144705" name="drawing"/>
             <wp:cNvGraphicFramePr>
-              <a:graphicFrameLocks noChangeAspect="1"/>
+              <a:graphicFrameLocks xmlns:a="http://schemas.openxmlformats.org/drawingml/2006/main" noChangeAspect="1"/>
             </wp:cNvGraphicFramePr>
-            <a:graphic>
-              <a:graphicData xmlns:a="http://schemas.openxmlformats.org/drawingml/2006/main" uri="http://schemas.openxmlformats.org/drawingml/2006/picture">
+            <a:graphic xmlns:a="http://schemas.openxmlformats.org/drawingml/2006/main">
+              <a:graphicData uri="http://schemas.openxmlformats.org/drawingml/2006/picture">
                 <pic:pic xmlns:pic="http://schemas.openxmlformats.org/drawingml/2006/picture">
                   <pic:nvPicPr>
                     <pic:cNvPr id="771144705" name="Picture 771144705"/>
                     <pic:cNvPicPr/>
                   </pic:nvPicPr>
                   <pic:blipFill>
-                    <a:blip xmlns:r="http://schemas.openxmlformats.org/officeDocument/2006/relationships" r:embed="rId123960431">
+                    <a:blip r:embed="rId18">
                       <a:extLst>
                         <a:ext uri="{28A0092B-C50C-407E-A947-70E740481C1C}">
                           <a14:useLocalDpi xmlns:a14="http://schemas.microsoft.com/office/drawing/2010/main"/>
@@ -2693,8 +2831,8 @@
       <w:r>
         <w:rPr>
           <w:rFonts w:ascii="Verdana" w:hAnsi="Verdana"/>
-          <w:b w:val="1"/>
-          <w:bCs w:val="1"/>
+          <w:b/>
+          <w:bCs/>
           <w:sz w:val="18"/>
           <w:szCs w:val="18"/>
         </w:rPr>
@@ -2703,84 +2841,270 @@
     </w:p>
     <w:p>
       <w:pPr>
-        <w:pStyle w:val="Normal"/>
-        <w:jc w:val="both"/>
-      </w:pPr>
-      <w:r>
-        <w:rPr>
-          <w:rFonts w:ascii="Verdana" w:hAnsi="Verdana"/>
-          <w:sz w:val="18"/>
-          <w:szCs w:val="18"/>
-        </w:rPr>
-        <w:t xml:space="preserve">Grassi, P. A., Fenton, J. L., Newton, E. M., </w:t>
-      </w:r>
-      <w:r>
-        <w:rPr>
-          <w:rFonts w:ascii="Verdana" w:hAnsi="Verdana"/>
-          <w:sz w:val="18"/>
-          <w:szCs w:val="18"/>
-        </w:rPr>
-        <w:t>Perlner</w:t>
-      </w:r>
-      <w:r>
-        <w:rPr>
-          <w:rFonts w:ascii="Verdana" w:hAnsi="Verdana"/>
-          <w:sz w:val="18"/>
-          <w:szCs w:val="18"/>
-        </w:rPr>
-        <w:t xml:space="preserve">, R. A., Regenscheid, A. R., Burr, W. E., &amp; Richer, J. P. (2017). Digital identity guidelines: Authentication and lifecycle management (NIST Special Publication 800-63B). National Institute of Standards and Technology. </w:t>
-      </w:r>
-      <w:hyperlink r:id="Rcf1db2c4466c47bd">
+        <w:spacing w:after="240"/>
+        <w:ind w:left="360" w:hanging="360"/>
+        <w:jc w:val="both"/>
+        <w:rPr>
+          <w:rFonts w:ascii="Verdana" w:hAnsi="Verdana"/>
+          <w:sz w:val="18"/>
+          <w:szCs w:val="18"/>
+        </w:rPr>
+      </w:pPr>
+    </w:p>
+    <w:p>
+      <w:pPr>
+        <w:spacing w:after="240"/>
+        <w:ind w:left="360" w:hanging="360"/>
+        <w:jc w:val="both"/>
+        <w:rPr>
+          <w:rFonts w:ascii="Verdana" w:hAnsi="Verdana"/>
+          <w:sz w:val="18"/>
+          <w:szCs w:val="18"/>
+        </w:rPr>
+      </w:pPr>
+      <w:r>
+        <w:rPr>
+          <w:rFonts w:ascii="Verdana" w:hAnsi="Verdana"/>
+          <w:sz w:val="18"/>
+          <w:szCs w:val="18"/>
+        </w:rPr>
+        <w:t xml:space="preserve">D2L. (2026). </w:t>
+      </w:r>
+      <w:r>
+        <w:rPr>
+          <w:rFonts w:ascii="Verdana" w:hAnsi="Verdana"/>
+          <w:i/>
+          <w:iCs/>
+          <w:sz w:val="18"/>
+          <w:szCs w:val="18"/>
+        </w:rPr>
+        <w:t>About LTI 1.3 launch and authentication.</w:t>
+      </w:r>
+      <w:r>
+        <w:rPr>
+          <w:rFonts w:ascii="Verdana" w:hAnsi="Verdana"/>
+          <w:sz w:val="18"/>
+          <w:szCs w:val="18"/>
+        </w:rPr>
+        <w:t xml:space="preserve"> Brightspace Community. </w:t>
+      </w:r>
+      <w:hyperlink w:history="1" r:id="rId19">
         <w:r>
           <w:rPr>
             <w:rStyle w:val="Hyperlink"/>
+            <w:rFonts w:ascii="Verdana" w:hAnsi="Verdana"/>
             <w:sz w:val="18"/>
             <w:szCs w:val="18"/>
           </w:rPr>
-          <w:t>https://doi.org/10.6028/NIST.SP.800-63b</w:t>
+          <w:t>https://community.d2l.com/brightspace/kb/articles/23730-about-lti-1-3-launch-and-authentication</w:t>
         </w:r>
       </w:hyperlink>
     </w:p>
     <w:p>
       <w:pPr>
-        <w:jc w:val="both"/>
-      </w:pPr>
-      <w:r>
-        <w:rPr>
-          <w:rFonts w:ascii="Verdana" w:hAnsi="Verdana"/>
-          <w:sz w:val="18"/>
-          <w:szCs w:val="18"/>
-        </w:rPr>
-        <w:t>scottbreenmsft</w:t>
-      </w:r>
-      <w:r>
-        <w:rPr>
-          <w:rFonts w:ascii="Verdana" w:hAnsi="Verdana"/>
-          <w:sz w:val="18"/>
-          <w:szCs w:val="18"/>
-        </w:rPr>
-        <w:t xml:space="preserve">. (2026, April 14). Set up Microsoft Entra ID - Microsoft Intune. </w:t>
-      </w:r>
-      <w:r>
-        <w:rPr>
-          <w:rFonts w:ascii="Verdana" w:hAnsi="Verdana"/>
-          <w:sz w:val="18"/>
-          <w:szCs w:val="18"/>
-        </w:rPr>
-        <w:t>MicrosoftLearn</w:t>
-      </w:r>
-      <w:r>
-        <w:rPr>
-          <w:rFonts w:ascii="Verdana" w:hAnsi="Verdana"/>
-          <w:sz w:val="18"/>
-          <w:szCs w:val="18"/>
-        </w:rPr>
-        <w:t xml:space="preserve">. </w:t>
-      </w:r>
-      <w:hyperlink r:id="R7fb4c7c6149444a3">
+        <w:spacing w:after="240"/>
+        <w:ind w:left="360" w:hanging="360"/>
+        <w:jc w:val="both"/>
+        <w:rPr>
+          <w:rFonts w:ascii="Verdana" w:hAnsi="Verdana"/>
+          <w:sz w:val="18"/>
+          <w:szCs w:val="18"/>
+        </w:rPr>
+      </w:pPr>
+      <w:r>
+        <w:rPr>
+          <w:rFonts w:ascii="Verdana" w:hAnsi="Verdana"/>
+          <w:sz w:val="18"/>
+          <w:szCs w:val="18"/>
+        </w:rPr>
+        <w:t>Google. (n.d</w:t>
+      </w:r>
+      <w:r>
+        <w:rPr>
+          <w:rFonts w:ascii="Verdana" w:hAnsi="Verdana"/>
+          <w:sz w:val="18"/>
+          <w:szCs w:val="18"/>
+        </w:rPr>
+        <w:t>.</w:t>
+      </w:r>
+      <w:r>
+        <w:rPr>
+          <w:rFonts w:ascii="Verdana" w:hAnsi="Verdana"/>
+          <w:sz w:val="18"/>
+          <w:szCs w:val="18"/>
+        </w:rPr>
+        <w:t xml:space="preserve">). </w:t>
+      </w:r>
+      <w:r>
+        <w:rPr>
+          <w:rFonts w:ascii="Verdana" w:hAnsi="Verdana"/>
+          <w:i/>
+          <w:iCs/>
+          <w:sz w:val="18"/>
+          <w:szCs w:val="18"/>
+        </w:rPr>
+        <w:t>Titan security key.</w:t>
+      </w:r>
+      <w:r>
+        <w:rPr>
+          <w:rFonts w:ascii="Verdana" w:hAnsi="Verdana"/>
+          <w:sz w:val="18"/>
+          <w:szCs w:val="18"/>
+        </w:rPr>
+        <w:t xml:space="preserve"> Google Cloud. Retrieved July 24, 2026, from </w:t>
+      </w:r>
+      <w:hyperlink w:history="1" r:id="rId20">
         <w:r>
           <w:rPr>
             <w:rStyle w:val="Hyperlink"/>
+            <w:rFonts w:ascii="Verdana" w:hAnsi="Verdana"/>
+            <w:sz w:val="18"/>
+            <w:szCs w:val="18"/>
+          </w:rPr>
+          <w:t>https://cloud.google.com/security/products/titan-security-key</w:t>
+        </w:r>
+      </w:hyperlink>
+    </w:p>
+    <w:p>
+      <w:pPr>
+        <w:spacing w:after="240"/>
+        <w:ind w:left="360" w:hanging="360"/>
+        <w:jc w:val="both"/>
+        <w:rPr>
+          <w:rFonts w:ascii="Verdana" w:hAnsi="Verdana"/>
+          <w:sz w:val="18"/>
+          <w:szCs w:val="18"/>
+        </w:rPr>
+      </w:pPr>
+      <w:r>
+        <w:rPr>
+          <w:rFonts w:ascii="Verdana" w:hAnsi="Verdana"/>
+          <w:sz w:val="18"/>
+          <w:szCs w:val="18"/>
+        </w:rPr>
+        <w:t xml:space="preserve">Microsoft. (2023). </w:t>
+      </w:r>
+      <w:r>
+        <w:rPr>
+          <w:rFonts w:ascii="Verdana" w:hAnsi="Verdana"/>
+          <w:i/>
+          <w:iCs/>
+          <w:sz w:val="18"/>
+          <w:szCs w:val="18"/>
+        </w:rPr>
+        <w:t>Trusted Platform Module technology overview.</w:t>
+      </w:r>
+      <w:r>
+        <w:rPr>
+          <w:rFonts w:ascii="Verdana" w:hAnsi="Verdana"/>
+          <w:sz w:val="18"/>
+          <w:szCs w:val="18"/>
+        </w:rPr>
+        <w:t xml:space="preserve"> Microsoft Learn. </w:t>
+      </w:r>
+      <w:hyperlink w:history="1" r:id="rId21">
+        <w:r>
+          <w:rPr>
+            <w:rStyle w:val="Hyperlink"/>
+            <w:rFonts w:ascii="Verdana" w:hAnsi="Verdana"/>
+            <w:sz w:val="18"/>
+            <w:szCs w:val="18"/>
+          </w:rPr>
+          <w:t>https://learn.microsoft.com/en-us/windows/security/hardware-security/tpm/trusted-platform-module-overview</w:t>
+        </w:r>
+      </w:hyperlink>
+    </w:p>
+    <w:p>
+      <w:pPr>
+        <w:spacing w:after="240"/>
+        <w:ind w:left="360" w:hanging="360"/>
+        <w:jc w:val="both"/>
+        <w:rPr>
+          <w:rFonts w:ascii="Verdana" w:hAnsi="Verdana"/>
+          <w:sz w:val="18"/>
+          <w:szCs w:val="18"/>
+        </w:rPr>
+      </w:pPr>
+      <w:r>
+        <w:rPr>
+          <w:rFonts w:ascii="Verdana" w:hAnsi="Verdana"/>
+          <w:sz w:val="18"/>
+          <w:szCs w:val="18"/>
+        </w:rPr>
+        <w:t xml:space="preserve">Microsoft. (2026a). </w:t>
+      </w:r>
+      <w:r>
+        <w:rPr>
+          <w:rFonts w:ascii="Verdana" w:hAnsi="Verdana"/>
+          <w:i/>
+          <w:iCs/>
+          <w:sz w:val="18"/>
+          <w:szCs w:val="18"/>
+        </w:rPr>
+        <w:t>Introduction to Microsoft Entra tenants.</w:t>
+      </w:r>
+      <w:r>
+        <w:rPr>
+          <w:rFonts w:ascii="Verdana" w:hAnsi="Verdana"/>
+          <w:sz w:val="18"/>
+          <w:szCs w:val="18"/>
+        </w:rPr>
+        <w:t xml:space="preserve"> Microsoft Learn. </w:t>
+      </w:r>
+      <w:hyperlink w:history="1" r:id="rId22">
+        <w:r>
+          <w:rPr>
+            <w:rStyle w:val="Hyperlink"/>
+            <w:rFonts w:ascii="Verdana" w:hAnsi="Verdana"/>
+            <w:sz w:val="18"/>
+            <w:szCs w:val="18"/>
+          </w:rPr>
+          <w:t>https://learn.microsoft.com/en-us/microsoft-365/education/guide/1-reference/introduction-microsoft-entra-id</w:t>
+        </w:r>
+      </w:hyperlink>
+    </w:p>
+    <w:p>
+      <w:pPr>
+        <w:spacing w:after="240"/>
+        <w:ind w:left="360" w:hanging="360"/>
+        <w:jc w:val="both"/>
+        <w:rPr>
+          <w:rFonts w:ascii="Verdana" w:hAnsi="Verdana"/>
+          <w:sz w:val="18"/>
+          <w:szCs w:val="18"/>
+        </w:rPr>
+      </w:pPr>
+      <w:r>
+        <w:rPr>
+          <w:rFonts w:ascii="Verdana" w:hAnsi="Verdana"/>
+          <w:sz w:val="18"/>
+          <w:szCs w:val="18"/>
+        </w:rPr>
+        <w:t xml:space="preserve">Microsoft. (2026b). </w:t>
+      </w:r>
+      <w:r>
+        <w:rPr>
+          <w:rFonts w:ascii="Verdana" w:hAnsi="Verdana"/>
+          <w:i/>
+          <w:iCs/>
+          <w:sz w:val="18"/>
+          <w:szCs w:val="18"/>
+        </w:rPr>
+        <w:t>Set up Microsoft Entra ID.</w:t>
+      </w:r>
+      <w:r>
+        <w:rPr>
+          <w:rFonts w:ascii="Verdana" w:hAnsi="Verdana"/>
+          <w:sz w:val="18"/>
+          <w:szCs w:val="18"/>
+        </w:rPr>
+        <w:t xml:space="preserve"> Microsoft Learn. </w:t>
+      </w:r>
+      <w:hyperlink w:history="1" r:id="rId23">
+        <w:r>
+          <w:rPr>
+            <w:rStyle w:val="Hyperlink"/>
+            <w:rFonts w:ascii="Verdana" w:hAnsi="Verdana"/>
             <w:sz w:val="18"/>
             <w:szCs w:val="18"/>
           </w:rPr>
@@ -2790,142 +3114,160 @@
     </w:p>
     <w:p>
       <w:pPr>
-        <w:jc w:val="both"/>
-      </w:pPr>
-      <w:r>
-        <w:rPr>
-          <w:rFonts w:ascii="Verdana" w:hAnsi="Verdana"/>
-          <w:sz w:val="18"/>
-          <w:szCs w:val="18"/>
-        </w:rPr>
-        <w:t>jennplatt</w:t>
-      </w:r>
-      <w:r>
-        <w:rPr>
-          <w:rFonts w:ascii="Verdana" w:hAnsi="Verdana"/>
-          <w:sz w:val="18"/>
-          <w:szCs w:val="18"/>
-        </w:rPr>
-        <w:t xml:space="preserve">. (2026). Introduction to Microsoft Entra </w:t>
-      </w:r>
-      <w:r>
-        <w:rPr>
-          <w:rFonts w:ascii="Verdana" w:hAnsi="Verdana"/>
-          <w:sz w:val="18"/>
-          <w:szCs w:val="18"/>
-        </w:rPr>
-        <w:t>tenants</w:t>
-      </w:r>
-      <w:r>
-        <w:rPr>
-          <w:rFonts w:ascii="Verdana" w:hAnsi="Verdana"/>
-          <w:sz w:val="18"/>
-          <w:szCs w:val="18"/>
-        </w:rPr>
-        <w:t xml:space="preserve"> - M365 Education. In Microsoft.com. </w:t>
-      </w:r>
-      <w:hyperlink r:id="Rbb84425b31c64223">
+        <w:spacing w:after="240"/>
+        <w:ind w:left="360" w:hanging="360"/>
+        <w:jc w:val="both"/>
+        <w:rPr>
+          <w:rFonts w:ascii="Verdana" w:hAnsi="Verdana"/>
+          <w:sz w:val="18"/>
+          <w:szCs w:val="18"/>
+        </w:rPr>
+      </w:pPr>
+      <w:r>
+        <w:rPr>
+          <w:rFonts w:ascii="Verdana" w:hAnsi="Verdana"/>
+          <w:sz w:val="18"/>
+          <w:szCs w:val="18"/>
+        </w:rPr>
+        <w:t xml:space="preserve">Microsoft. (2026c). </w:t>
+      </w:r>
+      <w:r>
+        <w:rPr>
+          <w:rFonts w:ascii="Verdana" w:hAnsi="Verdana"/>
+          <w:i/>
+          <w:iCs/>
+          <w:sz w:val="18"/>
+          <w:szCs w:val="18"/>
+        </w:rPr>
+        <w:t>Web Authentication APIs.</w:t>
+      </w:r>
+      <w:r>
+        <w:rPr>
+          <w:rFonts w:ascii="Verdana" w:hAnsi="Verdana"/>
+          <w:sz w:val="18"/>
+          <w:szCs w:val="18"/>
+        </w:rPr>
+        <w:t xml:space="preserve"> Microsoft Learn. </w:t>
+      </w:r>
+      <w:hyperlink w:history="1" r:id="rId24">
         <w:r>
           <w:rPr>
             <w:rStyle w:val="Hyperlink"/>
+            <w:rFonts w:ascii="Verdana" w:hAnsi="Verdana"/>
             <w:sz w:val="18"/>
             <w:szCs w:val="18"/>
           </w:rPr>
-          <w:t>https://learn.microsoft.com/en-us/microsoft-365/education/guide/1-reference/introduction-microsoft-entra-id</w:t>
+          <w:t>https://learn.microsoft.com/en-us/windows/security/identity-protection/hello-for-business/webauthn-apis</w:t>
         </w:r>
       </w:hyperlink>
     </w:p>
     <w:p>
       <w:pPr>
-        <w:jc w:val="both"/>
-      </w:pPr>
-      <w:r>
-        <w:rPr>
-          <w:rFonts w:ascii="Verdana" w:hAnsi="Verdana"/>
-          <w:sz w:val="18"/>
-          <w:szCs w:val="18"/>
-        </w:rPr>
-        <w:t xml:space="preserve">Microsoft. (2023). Trusted Platform Module Technology Overview - Windows Security. In learn.microsoft.com. </w:t>
-      </w:r>
-      <w:hyperlink r:id="R8f40b5036f334b08">
+        <w:spacing w:after="240"/>
+        <w:ind w:left="360" w:hanging="360"/>
+        <w:jc w:val="both"/>
+        <w:rPr>
+          <w:rFonts w:ascii="Verdana" w:hAnsi="Verdana"/>
+          <w:sz w:val="18"/>
+          <w:szCs w:val="18"/>
+        </w:rPr>
+      </w:pPr>
+      <w:r>
+        <w:rPr>
+          <w:rFonts w:ascii="Verdana" w:hAnsi="Verdana"/>
+          <w:sz w:val="18"/>
+          <w:szCs w:val="18"/>
+        </w:rPr>
+        <w:t xml:space="preserve">Mozilla Developer Network. (n.d.). </w:t>
+      </w:r>
+      <w:r>
+        <w:rPr>
+          <w:rFonts w:ascii="Verdana" w:hAnsi="Verdana"/>
+          <w:i/>
+          <w:iCs/>
+          <w:sz w:val="18"/>
+          <w:szCs w:val="18"/>
+        </w:rPr>
+        <w:t xml:space="preserve">Web Authentication API. </w:t>
+      </w:r>
+      <w:r>
+        <w:rPr>
+          <w:rFonts w:ascii="Verdana" w:hAnsi="Verdana"/>
+          <w:sz w:val="18"/>
+          <w:szCs w:val="18"/>
+        </w:rPr>
+        <w:t xml:space="preserve">MDN Web Docs. Retrieved July 24, 2026, from </w:t>
+      </w:r>
+      <w:hyperlink w:history="1" r:id="rId25">
         <w:r>
           <w:rPr>
             <w:rStyle w:val="Hyperlink"/>
+            <w:rFonts w:ascii="Verdana" w:hAnsi="Verdana"/>
             <w:sz w:val="18"/>
             <w:szCs w:val="18"/>
           </w:rPr>
-          <w:t>https://learn.microsoft.com/en-us/windows/security/hardware-security/tpm/trusted-platform-module-overview</w:t>
+          <w:t>https://developer.mozilla.org/en-US/docs/Web/API/Web_Authentication_API</w:t>
         </w:r>
       </w:hyperlink>
     </w:p>
     <w:p>
       <w:pPr>
-        <w:jc w:val="both"/>
-      </w:pPr>
-      <w:r>
-        <w:rPr>
-          <w:rFonts w:ascii="Verdana" w:hAnsi="Verdana"/>
-          <w:sz w:val="18"/>
-          <w:szCs w:val="18"/>
-        </w:rPr>
-        <w:t xml:space="preserve">Titan Security Key. (n.d.). In Google Cloud. Retrieved July 24, 2026, from </w:t>
-      </w:r>
-      <w:hyperlink r:id="R9cd48edc1070473b">
+        <w:spacing w:after="240"/>
+        <w:ind w:left="360" w:hanging="360"/>
+        <w:jc w:val="both"/>
+        <w:rPr>
+          <w:rFonts w:ascii="Verdana" w:hAnsi="Verdana"/>
+          <w:sz w:val="18"/>
+          <w:szCs w:val="18"/>
+        </w:rPr>
+      </w:pPr>
+      <w:proofErr w:type="spellStart"/>
+      <w:r>
+        <w:rPr>
+          <w:rFonts w:ascii="Verdana" w:hAnsi="Verdana"/>
+          <w:sz w:val="18"/>
+          <w:szCs w:val="18"/>
+        </w:rPr>
+        <w:t>Temoshok</w:t>
+      </w:r>
+      <w:proofErr w:type="spellEnd"/>
+      <w:r>
+        <w:rPr>
+          <w:rFonts w:ascii="Verdana" w:hAnsi="Verdana"/>
+          <w:sz w:val="18"/>
+          <w:szCs w:val="18"/>
+        </w:rPr>
+        <w:t xml:space="preserve">, D., Choong, Y., Regenscheid, A., Galluzzo, R., Fenton, J., Richer, J., &amp; Lefkovitz, N. (2025). </w:t>
+      </w:r>
+      <w:r>
+        <w:rPr>
+          <w:rFonts w:ascii="Verdana" w:hAnsi="Verdana"/>
+          <w:i/>
+          <w:iCs/>
+          <w:sz w:val="18"/>
+          <w:szCs w:val="18"/>
+        </w:rPr>
+        <w:t xml:space="preserve">Digital identity guidelines: Authentication and authenticator management </w:t>
+      </w:r>
+      <w:r>
+        <w:rPr>
+          <w:rFonts w:ascii="Verdana" w:hAnsi="Verdana"/>
+          <w:sz w:val="18"/>
+          <w:szCs w:val="18"/>
+        </w:rPr>
+        <w:t xml:space="preserve">(NIST Special Publication 800-63B-4). National Institute of Standards and Technology. </w:t>
+      </w:r>
+      <w:hyperlink w:history="1" r:id="rId26">
         <w:r>
           <w:rPr>
             <w:rStyle w:val="Hyperlink"/>
+            <w:rFonts w:ascii="Verdana" w:hAnsi="Verdana"/>
             <w:sz w:val="18"/>
             <w:szCs w:val="18"/>
           </w:rPr>
-          <w:t>https://cloud.google.com/security/products/titan-security-key</w:t>
+          <w:t>https://doi.org/10.6028/NIST.SP.800-63B-4</w:t>
         </w:r>
       </w:hyperlink>
-    </w:p>
-    <w:p>
-      <w:pPr>
-        <w:jc w:val="both"/>
-      </w:pPr>
-      <w:r>
-        <w:rPr>
-          <w:rFonts w:ascii="Verdana" w:hAnsi="Verdana"/>
-          <w:sz w:val="18"/>
-          <w:szCs w:val="18"/>
-        </w:rPr>
-        <w:t xml:space="preserve">About LTI 1.3 launch and authentication - Brightspace. (2026). Brightspace. </w:t>
-      </w:r>
-      <w:hyperlink r:id="Rc369933877ed4d51">
-        <w:r>
-          <w:rPr>
-            <w:rStyle w:val="Hyperlink"/>
-            <w:sz w:val="18"/>
-            <w:szCs w:val="18"/>
-          </w:rPr>
-          <w:t>https://community.d2l.com/brightspace/kb/articles/23730-about-lti-1-3-launch-and-authentication</w:t>
-        </w:r>
-      </w:hyperlink>
-    </w:p>
-    <w:p>
-      <w:pPr>
-        <w:jc w:val="both"/>
-        <w:rPr>
-          <w:rFonts w:ascii="Verdana" w:hAnsi="Verdana"/>
-          <w:sz w:val="18"/>
-          <w:szCs w:val="18"/>
-        </w:rPr>
-      </w:pPr>
-    </w:p>
-    <w:p>
-      <w:pPr>
-        <w:spacing w:before="120"/>
-        <w:ind w:left="360" w:hanging="360"/>
-        <w:jc w:val="both"/>
-        <w:rPr>
-          <w:rFonts w:ascii="Verdana" w:hAnsi="Verdana"/>
-          <w:color w:val="FF0000"/>
-          <w:sz w:val="18"/>
-          <w:szCs w:val="18"/>
-        </w:rPr>
-      </w:pPr>
     </w:p>
     <w:sectPr>
       <w:type w:val="continuous"/>
@@ -2939,7 +3281,7 @@
 </file>
 
 <file path=word/endnotes.xml><?xml version="1.0" encoding="utf-8"?>
-<w:endnotes xmlns:wpc="http://schemas.microsoft.com/office/word/2010/wordprocessingCanvas" xmlns:cx="http://schemas.microsoft.com/office/drawing/2014/chartex" xmlns:cx1="http://schemas.microsoft.com/office/drawing/2015/9/8/chartex" xmlns:cx2="http://schemas.microsoft.com/office/drawing/2015/10/21/chartex" xmlns:cx3="http://schemas.microsoft.com/office/drawing/2016/5/9/chartex" xmlns:cx4="http://schemas.microsoft.com/office/drawing/2016/5/10/chartex" xmlns:cx5="http://schemas.microsoft.com/office/drawing/2016/5/11/chartex" xmlns:cx6="http://schemas.microsoft.com/office/drawing/2016/5/12/chartex" xmlns:cx7="http://schemas.microsoft.com/office/drawing/2016/5/13/chartex" xmlns:cx8="http://schemas.microsoft.com/office/drawing/2016/5/14/chartex" xmlns:mc="http://schemas.openxmlformats.org/markup-compatibility/2006" xmlns:aink="http://schemas.microsoft.com/office/drawing/2016/ink" xmlns:am3d="http://schemas.microsoft.com/office/drawing/2017/model3d" xmlns:o="urn:schemas-microsoft-com:office:office" xmlns:oel="http://schemas.microsoft.com/office/2019/extlst" xmlns:r="http://schemas.openxmlformats.org/officeDocument/2006/relationships" xmlns:m="http://schemas.openxmlformats.org/officeDocument/2006/math" xmlns:v="urn:schemas-microsoft-com:vml" xmlns:wp14="http://schemas.microsoft.com/office/word/2010/wordprocessingDrawing" xmlns:wp="http://schemas.openxmlformats.org/drawingml/2006/wordprocessingDrawing" xmlns:w10="urn:schemas-microsoft-com:office:word" xmlns:w="http://schemas.openxmlformats.org/wordprocessingml/2006/main" xmlns:w14="http://schemas.microsoft.com/office/word/2010/wordml" xmlns:w15="http://schemas.microsoft.com/office/word/2012/wordml" xmlns:w16cex="http://schemas.microsoft.com/office/word/2018/wordml/cex" xmlns:w16cid="http://schemas.microsoft.com/office/word/2016/wordml/cid" xmlns:w16="http://schemas.microsoft.com/office/word/2018/wordml" xmlns:w16du="http://schemas.microsoft.com/office/word/2023/wordml/word16du" xmlns:w16sdtdh="http://schemas.microsoft.com/office/word/2020/wordml/sdtdatahash" xmlns:w16sdtfl="http://schemas.microsoft.com/office/word/2024/wordml/sdtformatlock" xmlns:w16se="http://schemas.microsoft.com/office/word/2015/wordml/symex" xmlns:wpg="http://schemas.microsoft.com/office/word/2010/wordprocessingGroup" xmlns:wpi="http://schemas.microsoft.com/office/word/2010/wordprocessingInk" xmlns:wne="http://schemas.microsoft.com/office/word/2006/wordml" xmlns:wps="http://schemas.microsoft.com/office/word/2010/wordprocessingShape" mc:Ignorable="w14 w15 w16se w16cid w16 w16cex w16sdtdh w16sdtfl w16du wp14">
+<w:endnotes xmlns:wpc="http://schemas.microsoft.com/office/word/2010/wordprocessingCanvas" xmlns:cx="http://schemas.microsoft.com/office/drawing/2014/chartex" xmlns:cx1="http://schemas.microsoft.com/office/drawing/2015/9/8/chartex" xmlns:cx2="http://schemas.microsoft.com/office/drawing/2015/10/21/chartex" xmlns:cx3="http://schemas.microsoft.com/office/drawing/2016/5/9/chartex" xmlns:cx4="http://schemas.microsoft.com/office/drawing/2016/5/10/chartex" xmlns:cx5="http://schemas.microsoft.com/office/drawing/2016/5/11/chartex" xmlns:cx6="http://schemas.microsoft.com/office/drawing/2016/5/12/chartex" xmlns:cx7="http://schemas.microsoft.com/office/drawing/2016/5/13/chartex" xmlns:cx8="http://schemas.microsoft.com/office/drawing/2016/5/14/chartex" xmlns:mc="http://schemas.openxmlformats.org/markup-compatibility/2006" xmlns:aink="http://schemas.microsoft.com/office/drawing/2016/ink" xmlns:am3d="http://schemas.microsoft.com/office/drawing/2017/model3d" xmlns:o="urn:schemas-microsoft-com:office:office" xmlns:oel="http://schemas.microsoft.com/office/2019/extlst" xmlns:r="http://schemas.openxmlformats.org/officeDocument/2006/relationships" xmlns:m="http://schemas.openxmlformats.org/officeDocument/2006/math" xmlns:v="urn:schemas-microsoft-com:vml" xmlns:wp14="http://schemas.microsoft.com/office/word/2010/wordprocessingDrawing" xmlns:wp="http://schemas.openxmlformats.org/drawingml/2006/wordprocessingDrawing" xmlns:w10="urn:schemas-microsoft-com:office:word" xmlns:w="http://schemas.openxmlformats.org/wordprocessingml/2006/main" xmlns:w14="http://schemas.microsoft.com/office/word/2010/wordml" xmlns:w15="http://schemas.microsoft.com/office/word/2012/wordml" xmlns:w16cei="http://schemas.microsoft.com/office/word/2026/wordml/cei" xmlns:w16cex="http://schemas.microsoft.com/office/word/2018/wordml/cex" xmlns:w16cid="http://schemas.microsoft.com/office/word/2016/wordml/cid" xmlns:w16="http://schemas.microsoft.com/office/word/2018/wordml" xmlns:w16du="http://schemas.microsoft.com/office/word/2023/wordml/word16du" xmlns:w16sdtdh="http://schemas.microsoft.com/office/word/2020/wordml/sdtdatahash" xmlns:w16sdtfl="http://schemas.microsoft.com/office/word/2024/wordml/sdtformatlock" xmlns:w16se="http://schemas.microsoft.com/office/word/2015/wordml/symex" xmlns:wpg="http://schemas.microsoft.com/office/word/2010/wordprocessingGroup" xmlns:wpi="http://schemas.microsoft.com/office/word/2010/wordprocessingInk" xmlns:wne="http://schemas.microsoft.com/office/word/2006/wordml" xmlns:wps="http://schemas.microsoft.com/office/word/2010/wordprocessingShape" mc:Ignorable="w14 w15 w16se w16cid w16 w16cex w16sdtdh w16sdtfl w16du wp14">
   <w:endnote w:type="separator" w:id="-1">
     <w:p>
       <w:r>
@@ -2958,7 +3300,7 @@
 </file>
 
 <file path=word/footer1.xml><?xml version="1.0" encoding="utf-8"?>
-<w:ftr xmlns:wpc="http://schemas.microsoft.com/office/word/2010/wordprocessingCanvas" xmlns:cx="http://schemas.microsoft.com/office/drawing/2014/chartex" xmlns:cx1="http://schemas.microsoft.com/office/drawing/2015/9/8/chartex" xmlns:cx2="http://schemas.microsoft.com/office/drawing/2015/10/21/chartex" xmlns:cx3="http://schemas.microsoft.com/office/drawing/2016/5/9/chartex" xmlns:cx4="http://schemas.microsoft.com/office/drawing/2016/5/10/chartex" xmlns:cx5="http://schemas.microsoft.com/office/drawing/2016/5/11/chartex" xmlns:cx6="http://schemas.microsoft.com/office/drawing/2016/5/12/chartex" xmlns:cx7="http://schemas.microsoft.com/office/drawing/2016/5/13/chartex" xmlns:cx8="http://schemas.microsoft.com/office/drawing/2016/5/14/chartex" xmlns:mc="http://schemas.openxmlformats.org/markup-compatibility/2006" xmlns:aink="http://schemas.microsoft.com/office/drawing/2016/ink" xmlns:am3d="http://schemas.microsoft.com/office/drawing/2017/model3d" xmlns:o="urn:schemas-microsoft-com:office:office" xmlns:oel="http://schemas.microsoft.com/office/2019/extlst" xmlns:r="http://schemas.openxmlformats.org/officeDocument/2006/relationships" xmlns:m="http://schemas.openxmlformats.org/officeDocument/2006/math" xmlns:v="urn:schemas-microsoft-com:vml" xmlns:wp14="http://schemas.microsoft.com/office/word/2010/wordprocessingDrawing" xmlns:wp="http://schemas.openxmlformats.org/drawingml/2006/wordprocessingDrawing" xmlns:w10="urn:schemas-microsoft-com:office:word" xmlns:w="http://schemas.openxmlformats.org/wordprocessingml/2006/main" xmlns:w14="http://schemas.microsoft.com/office/word/2010/wordml" xmlns:w15="http://schemas.microsoft.com/office/word/2012/wordml" xmlns:w16cex="http://schemas.microsoft.com/office/word/2018/wordml/cex" xmlns:w16cid="http://schemas.microsoft.com/office/word/2016/wordml/cid" xmlns:w16="http://schemas.microsoft.com/office/word/2018/wordml" xmlns:w16du="http://schemas.microsoft.com/office/word/2023/wordml/word16du" xmlns:w16sdtdh="http://schemas.microsoft.com/office/word/2020/wordml/sdtdatahash" xmlns:w16sdtfl="http://schemas.microsoft.com/office/word/2024/wordml/sdtformatlock" xmlns:w16se="http://schemas.microsoft.com/office/word/2015/wordml/symex" xmlns:wpg="http://schemas.microsoft.com/office/word/2010/wordprocessingGroup" xmlns:wpi="http://schemas.microsoft.com/office/word/2010/wordprocessingInk" xmlns:wne="http://schemas.microsoft.com/office/word/2006/wordml" xmlns:wps="http://schemas.microsoft.com/office/word/2010/wordprocessingShape" mc:Ignorable="w14 w15 w16se w16cid w16 w16cex w16sdtdh w16sdtfl w16du wp14">
+<w:ftr xmlns:wpc="http://schemas.microsoft.com/office/word/2010/wordprocessingCanvas" xmlns:cx="http://schemas.microsoft.com/office/drawing/2014/chartex" xmlns:cx1="http://schemas.microsoft.com/office/drawing/2015/9/8/chartex" xmlns:cx2="http://schemas.microsoft.com/office/drawing/2015/10/21/chartex" xmlns:cx3="http://schemas.microsoft.com/office/drawing/2016/5/9/chartex" xmlns:cx4="http://schemas.microsoft.com/office/drawing/2016/5/10/chartex" xmlns:cx5="http://schemas.microsoft.com/office/drawing/2016/5/11/chartex" xmlns:cx6="http://schemas.microsoft.com/office/drawing/2016/5/12/chartex" xmlns:cx7="http://schemas.microsoft.com/office/drawing/2016/5/13/chartex" xmlns:cx8="http://schemas.microsoft.com/office/drawing/2016/5/14/chartex" xmlns:mc="http://schemas.openxmlformats.org/markup-compatibility/2006" xmlns:aink="http://schemas.microsoft.com/office/drawing/2016/ink" xmlns:am3d="http://schemas.microsoft.com/office/drawing/2017/model3d" xmlns:o="urn:schemas-microsoft-com:office:office" xmlns:oel="http://schemas.microsoft.com/office/2019/extlst" xmlns:r="http://schemas.openxmlformats.org/officeDocument/2006/relationships" xmlns:m="http://schemas.openxmlformats.org/officeDocument/2006/math" xmlns:v="urn:schemas-microsoft-com:vml" xmlns:wp14="http://schemas.microsoft.com/office/word/2010/wordprocessingDrawing" xmlns:wp="http://schemas.openxmlformats.org/drawingml/2006/wordprocessingDrawing" xmlns:w10="urn:schemas-microsoft-com:office:word" xmlns:w="http://schemas.openxmlformats.org/wordprocessingml/2006/main" xmlns:w14="http://schemas.microsoft.com/office/word/2010/wordml" xmlns:w15="http://schemas.microsoft.com/office/word/2012/wordml" xmlns:w16cei="http://schemas.microsoft.com/office/word/2026/wordml/cei" xmlns:w16cex="http://schemas.microsoft.com/office/word/2018/wordml/cex" xmlns:w16cid="http://schemas.microsoft.com/office/word/2016/wordml/cid" xmlns:w16="http://schemas.microsoft.com/office/word/2018/wordml" xmlns:w16du="http://schemas.microsoft.com/office/word/2023/wordml/word16du" xmlns:w16sdtdh="http://schemas.microsoft.com/office/word/2020/wordml/sdtdatahash" xmlns:w16sdtfl="http://schemas.microsoft.com/office/word/2024/wordml/sdtformatlock" xmlns:w16se="http://schemas.microsoft.com/office/word/2015/wordml/symex" xmlns:wpg="http://schemas.microsoft.com/office/word/2010/wordprocessingGroup" xmlns:wpi="http://schemas.microsoft.com/office/word/2010/wordprocessingInk" xmlns:wne="http://schemas.microsoft.com/office/word/2006/wordml" xmlns:wps="http://schemas.microsoft.com/office/word/2010/wordprocessingShape" mc:Ignorable="w14 w15 w16se w16cid w16 w16cex w16sdtdh w16sdtfl w16du wp14">
   <w:sdt>
     <w:sdtPr>
       <w:id w:val="1061759231"/>
@@ -3011,7 +3353,7 @@
 </file>
 
 <file path=word/footnotes.xml><?xml version="1.0" encoding="utf-8"?>
-<w:footnotes xmlns:wpc="http://schemas.microsoft.com/office/word/2010/wordprocessingCanvas" xmlns:cx="http://schemas.microsoft.com/office/drawing/2014/chartex" xmlns:cx1="http://schemas.microsoft.com/office/drawing/2015/9/8/chartex" xmlns:cx2="http://schemas.microsoft.com/office/drawing/2015/10/21/chartex" xmlns:cx3="http://schemas.microsoft.com/office/drawing/2016/5/9/chartex" xmlns:cx4="http://schemas.microsoft.com/office/drawing/2016/5/10/chartex" xmlns:cx5="http://schemas.microsoft.com/office/drawing/2016/5/11/chartex" xmlns:cx6="http://schemas.microsoft.com/office/drawing/2016/5/12/chartex" xmlns:cx7="http://schemas.microsoft.com/office/drawing/2016/5/13/chartex" xmlns:cx8="http://schemas.microsoft.com/office/drawing/2016/5/14/chartex" xmlns:mc="http://schemas.openxmlformats.org/markup-compatibility/2006" xmlns:aink="http://schemas.microsoft.com/office/drawing/2016/ink" xmlns:am3d="http://schemas.microsoft.com/office/drawing/2017/model3d" xmlns:o="urn:schemas-microsoft-com:office:office" xmlns:oel="http://schemas.microsoft.com/office/2019/extlst" xmlns:r="http://schemas.openxmlformats.org/officeDocument/2006/relationships" xmlns:m="http://schemas.openxmlformats.org/officeDocument/2006/math" xmlns:v="urn:schemas-microsoft-com:vml" xmlns:wp14="http://schemas.microsoft.com/office/word/2010/wordprocessingDrawing" xmlns:wp="http://schemas.openxmlformats.org/drawingml/2006/wordprocessingDrawing" xmlns:w10="urn:schemas-microsoft-com:office:word" xmlns:w="http://schemas.openxmlformats.org/wordprocessingml/2006/main" xmlns:w14="http://schemas.microsoft.com/office/word/2010/wordml" xmlns:w15="http://schemas.microsoft.com/office/word/2012/wordml" xmlns:w16cex="http://schemas.microsoft.com/office/word/2018/wordml/cex" xmlns:w16cid="http://schemas.microsoft.com/office/word/2016/wordml/cid" xmlns:w16="http://schemas.microsoft.com/office/word/2018/wordml" xmlns:w16du="http://schemas.microsoft.com/office/word/2023/wordml/word16du" xmlns:w16sdtdh="http://schemas.microsoft.com/office/word/2020/wordml/sdtdatahash" xmlns:w16sdtfl="http://schemas.microsoft.com/office/word/2024/wordml/sdtformatlock" xmlns:w16se="http://schemas.microsoft.com/office/word/2015/wordml/symex" xmlns:wpg="http://schemas.microsoft.com/office/word/2010/wordprocessingGroup" xmlns:wpi="http://schemas.microsoft.com/office/word/2010/wordprocessingInk" xmlns:wne="http://schemas.microsoft.com/office/word/2006/wordml" xmlns:wps="http://schemas.microsoft.com/office/word/2010/wordprocessingShape" mc:Ignorable="w14 w15 w16se w16cid w16 w16cex w16sdtdh w16sdtfl w16du wp14">
+<w:footnotes xmlns:wpc="http://schemas.microsoft.com/office/word/2010/wordprocessingCanvas" xmlns:cx="http://schemas.microsoft.com/office/drawing/2014/chartex" xmlns:cx1="http://schemas.microsoft.com/office/drawing/2015/9/8/chartex" xmlns:cx2="http://schemas.microsoft.com/office/drawing/2015/10/21/chartex" xmlns:cx3="http://schemas.microsoft.com/office/drawing/2016/5/9/chartex" xmlns:cx4="http://schemas.microsoft.com/office/drawing/2016/5/10/chartex" xmlns:cx5="http://schemas.microsoft.com/office/drawing/2016/5/11/chartex" xmlns:cx6="http://schemas.microsoft.com/office/drawing/2016/5/12/chartex" xmlns:cx7="http://schemas.microsoft.com/office/drawing/2016/5/13/chartex" xmlns:cx8="http://schemas.microsoft.com/office/drawing/2016/5/14/chartex" xmlns:mc="http://schemas.openxmlformats.org/markup-compatibility/2006" xmlns:aink="http://schemas.microsoft.com/office/drawing/2016/ink" xmlns:am3d="http://schemas.microsoft.com/office/drawing/2017/model3d" xmlns:o="urn:schemas-microsoft-com:office:office" xmlns:oel="http://schemas.microsoft.com/office/2019/extlst" xmlns:r="http://schemas.openxmlformats.org/officeDocument/2006/relationships" xmlns:m="http://schemas.openxmlformats.org/officeDocument/2006/math" xmlns:v="urn:schemas-microsoft-com:vml" xmlns:wp14="http://schemas.microsoft.com/office/word/2010/wordprocessingDrawing" xmlns:wp="http://schemas.openxmlformats.org/drawingml/2006/wordprocessingDrawing" xmlns:w10="urn:schemas-microsoft-com:office:word" xmlns:w="http://schemas.openxmlformats.org/wordprocessingml/2006/main" xmlns:w14="http://schemas.microsoft.com/office/word/2010/wordml" xmlns:w15="http://schemas.microsoft.com/office/word/2012/wordml" xmlns:w16cei="http://schemas.microsoft.com/office/word/2026/wordml/cei" xmlns:w16cex="http://schemas.microsoft.com/office/word/2018/wordml/cex" xmlns:w16cid="http://schemas.microsoft.com/office/word/2016/wordml/cid" xmlns:w16="http://schemas.microsoft.com/office/word/2018/wordml" xmlns:w16du="http://schemas.microsoft.com/office/word/2023/wordml/word16du" xmlns:w16sdtdh="http://schemas.microsoft.com/office/word/2020/wordml/sdtdatahash" xmlns:w16sdtfl="http://schemas.microsoft.com/office/word/2024/wordml/sdtformatlock" xmlns:w16se="http://schemas.microsoft.com/office/word/2015/wordml/symex" xmlns:wpg="http://schemas.microsoft.com/office/word/2010/wordprocessingGroup" xmlns:wpi="http://schemas.microsoft.com/office/word/2010/wordprocessingInk" xmlns:wne="http://schemas.microsoft.com/office/word/2006/wordml" xmlns:wps="http://schemas.microsoft.com/office/word/2010/wordprocessingShape" mc:Ignorable="w14 w15 w16se w16cid w16 w16cex w16sdtdh w16sdtfl w16du wp14">
   <w:footnote w:type="separator" w:id="-1">
     <w:p>
       <w:r>
@@ -3030,7 +3372,7 @@
 </file>
 
 <file path=word/numbering.xml><?xml version="1.0" encoding="utf-8"?>
-<w:numbering xmlns:wpc="http://schemas.microsoft.com/office/word/2010/wordprocessingCanvas" xmlns:cx="http://schemas.microsoft.com/office/drawing/2014/chartex" xmlns:cx1="http://schemas.microsoft.com/office/drawing/2015/9/8/chartex" xmlns:cx2="http://schemas.microsoft.com/office/drawing/2015/10/21/chartex" xmlns:cx3="http://schemas.microsoft.com/office/drawing/2016/5/9/chartex" xmlns:cx4="http://schemas.microsoft.com/office/drawing/2016/5/10/chartex" xmlns:cx5="http://schemas.microsoft.com/office/drawing/2016/5/11/chartex" xmlns:cx6="http://schemas.microsoft.com/office/drawing/2016/5/12/chartex" xmlns:cx7="http://schemas.microsoft.com/office/drawing/2016/5/13/chartex" xmlns:cx8="http://schemas.microsoft.com/office/drawing/2016/5/14/chartex" xmlns:mc="http://schemas.openxmlformats.org/markup-compatibility/2006" xmlns:aink="http://schemas.microsoft.com/office/drawing/2016/ink" xmlns:am3d="http://schemas.microsoft.com/office/drawing/2017/model3d" xmlns:o="urn:schemas-microsoft-com:office:office" xmlns:oel="http://schemas.microsoft.com/office/2019/extlst" xmlns:r="http://schemas.openxmlformats.org/officeDocument/2006/relationships" xmlns:m="http://schemas.openxmlformats.org/officeDocument/2006/math" xmlns:v="urn:schemas-microsoft-com:vml" xmlns:wp14="http://schemas.microsoft.com/office/word/2010/wordprocessingDrawing" xmlns:wp="http://schemas.openxmlformats.org/drawingml/2006/wordprocessingDrawing" xmlns:w10="urn:schemas-microsoft-com:office:word" xmlns:w="http://schemas.openxmlformats.org/wordprocessingml/2006/main" xmlns:w14="http://schemas.microsoft.com/office/word/2010/wordml" xmlns:w15="http://schemas.microsoft.com/office/word/2012/wordml" xmlns:w16cex="http://schemas.microsoft.com/office/word/2018/wordml/cex" xmlns:w16cid="http://schemas.microsoft.com/office/word/2016/wordml/cid" xmlns:w16="http://schemas.microsoft.com/office/word/2018/wordml" xmlns:w16du="http://schemas.microsoft.com/office/word/2023/wordml/word16du" xmlns:w16sdtdh="http://schemas.microsoft.com/office/word/2020/wordml/sdtdatahash" xmlns:w16sdtfl="http://schemas.microsoft.com/office/word/2024/wordml/sdtformatlock" xmlns:w16se="http://schemas.microsoft.com/office/word/2015/wordml/symex" xmlns:wpg="http://schemas.microsoft.com/office/word/2010/wordprocessingGroup" xmlns:wpi="http://schemas.microsoft.com/office/word/2010/wordprocessingInk" xmlns:wne="http://schemas.microsoft.com/office/word/2006/wordml" xmlns:wps="http://schemas.microsoft.com/office/word/2010/wordprocessingShape" mc:Ignorable="w14 w15 w16se w16cid w16 w16cex w16sdtdh w16sdtfl w16du wp14">
+<w:numbering xmlns:wpc="http://schemas.microsoft.com/office/word/2010/wordprocessingCanvas" xmlns:cx="http://schemas.microsoft.com/office/drawing/2014/chartex" xmlns:cx1="http://schemas.microsoft.com/office/drawing/2015/9/8/chartex" xmlns:cx2="http://schemas.microsoft.com/office/drawing/2015/10/21/chartex" xmlns:cx3="http://schemas.microsoft.com/office/drawing/2016/5/9/chartex" xmlns:cx4="http://schemas.microsoft.com/office/drawing/2016/5/10/chartex" xmlns:cx5="http://schemas.microsoft.com/office/drawing/2016/5/11/chartex" xmlns:cx6="http://schemas.microsoft.com/office/drawing/2016/5/12/chartex" xmlns:cx7="http://schemas.microsoft.com/office/drawing/2016/5/13/chartex" xmlns:cx8="http://schemas.microsoft.com/office/drawing/2016/5/14/chartex" xmlns:mc="http://schemas.openxmlformats.org/markup-compatibility/2006" xmlns:aink="http://schemas.microsoft.com/office/drawing/2016/ink" xmlns:am3d="http://schemas.microsoft.com/office/drawing/2017/model3d" xmlns:o="urn:schemas-microsoft-com:office:office" xmlns:oel="http://schemas.microsoft.com/office/2019/extlst" xmlns:r="http://schemas.openxmlformats.org/officeDocument/2006/relationships" xmlns:m="http://schemas.openxmlformats.org/officeDocument/2006/math" xmlns:v="urn:schemas-microsoft-com:vml" xmlns:wp14="http://schemas.microsoft.com/office/word/2010/wordprocessingDrawing" xmlns:wp="http://schemas.openxmlformats.org/drawingml/2006/wordprocessingDrawing" xmlns:w10="urn:schemas-microsoft-com:office:word" xmlns:w="http://schemas.openxmlformats.org/wordprocessingml/2006/main" xmlns:w14="http://schemas.microsoft.com/office/word/2010/wordml" xmlns:w15="http://schemas.microsoft.com/office/word/2012/wordml" xmlns:w16cei="http://schemas.microsoft.com/office/word/2026/wordml/cei" xmlns:w16cex="http://schemas.microsoft.com/office/word/2018/wordml/cex" xmlns:w16cid="http://schemas.microsoft.com/office/word/2016/wordml/cid" xmlns:w16="http://schemas.microsoft.com/office/word/2018/wordml" xmlns:w16du="http://schemas.microsoft.com/office/word/2023/wordml/word16du" xmlns:w16sdtdh="http://schemas.microsoft.com/office/word/2020/wordml/sdtdatahash" xmlns:w16sdtfl="http://schemas.microsoft.com/office/word/2024/wordml/sdtformatlock" xmlns:w16se="http://schemas.microsoft.com/office/word/2015/wordml/symex" xmlns:wpg="http://schemas.microsoft.com/office/word/2010/wordprocessingGroup" xmlns:wpi="http://schemas.microsoft.com/office/word/2010/wordprocessingInk" xmlns:wne="http://schemas.microsoft.com/office/word/2006/wordml" xmlns:wps="http://schemas.microsoft.com/office/word/2010/wordprocessingShape" mc:Ignorable="w14 w15 w16se w16cid w16 w16cex w16sdtdh w16sdtfl w16du wp14">
   <w:abstractNum w:abstractNumId="0" w15:restartNumberingAfterBreak="0">
     <w:nsid w:val="0AF212B4"/>
     <w:multiLevelType w:val="multilevel"/>
@@ -3989,7 +4331,6 @@
   <w:style w:type="character" w:styleId="DefaultParagraphFont" w:default="1">
     <w:name w:val="Default Paragraph Font"/>
     <w:uiPriority w:val="1"/>
-    <w:semiHidden/>
     <w:unhideWhenUsed/>
   </w:style>
   <w:style w:type="table" w:styleId="TableNormal" w:default="1">
@@ -4237,6 +4578,17 @@
       <w:ind w:left="720"/>
       <w:contextualSpacing/>
     </w:pPr>
+  </w:style>
+  <w:style w:type="character" w:styleId="FollowedHyperlink">
+    <w:name w:val="FollowedHyperlink"/>
+    <w:basedOn w:val="DefaultParagraphFont"/>
+    <w:semiHidden/>
+    <w:unhideWhenUsed/>
+    <w:rsid w:val="00501879"/>
+    <w:rPr>
+      <w:color w:val="800080" w:themeColor="followedHyperlink"/>
+      <w:u w:val="single"/>
+    </w:rPr>
   </w:style>
 </w:styles>
 </file>
@@ -4525,6 +4877,12 @@
 </file>
 
 <file path=customXml/item1.xml><?xml version="1.0" encoding="utf-8"?>
+<p:properties xmlns:p="http://schemas.microsoft.com/office/2006/metadata/properties" xmlns:xsi="http://www.w3.org/2001/XMLSchema-instance" xmlns:pc="http://schemas.microsoft.com/office/infopath/2007/PartnerControls">
+  <documentManagement/>
+</p:properties>
+</file>
+
+<file path=customXml/item2.xml><?xml version="1.0" encoding="utf-8"?>
 <ct:contentTypeSchema xmlns:ct="http://schemas.microsoft.com/office/2006/metadata/contentType" xmlns:ma="http://schemas.microsoft.com/office/2006/metadata/properties/metaAttributes" ct:_="" ma:_="" ma:contentTypeName="Document" ma:contentTypeID="0x010100934AF10A37F87B43970F7CFB5E84EB76" ma:contentTypeVersion="13" ma:contentTypeDescription="Create a new document." ma:contentTypeScope="" ma:versionID="88e9cb743170b028758d1191eb5ebe30">
   <xsd:schema xmlns:xsd="http://www.w3.org/2001/XMLSchema" xmlns:xs="http://www.w3.org/2001/XMLSchema" xmlns:p="http://schemas.microsoft.com/office/2006/metadata/properties" xmlns:ns3="995b2506-1074-4ddc-af93-d4437205e205" xmlns:ns4="8b5094ac-e50c-4f5c-965f-37193990e5fe" targetNamespace="http://schemas.microsoft.com/office/2006/metadata/properties" ma:root="true" ma:fieldsID="4f433da9594677a5c5f53024645c1c15" ns3:_="" ns4:_="">
     <xsd:import namespace="995b2506-1074-4ddc-af93-d4437205e205"/>
@@ -4747,12 +5105,6 @@
 </ct:contentTypeSchema>
 </file>
 
-<file path=customXml/item2.xml><?xml version="1.0" encoding="utf-8"?>
-<p:properties xmlns:p="http://schemas.microsoft.com/office/2006/metadata/properties" xmlns:xsi="http://www.w3.org/2001/XMLSchema-instance" xmlns:pc="http://schemas.microsoft.com/office/infopath/2007/PartnerControls">
-  <documentManagement/>
-</p:properties>
-</file>
-
 <file path=customXml/item3.xml><?xml version="1.0" encoding="utf-8"?>
 <?mso-contentType ?>
 <FormTemplates xmlns="http://schemas.microsoft.com/sharepoint/v3/contenttype/forms">
@@ -4763,6 +5115,15 @@
 </file>
 
 <file path=customXml/itemProps1.xml><?xml version="1.0" encoding="utf-8"?>
+<ds:datastoreItem xmlns:ds="http://schemas.openxmlformats.org/officeDocument/2006/customXml" ds:itemID="{7FFCF9B0-A5DD-4ED9-88C0-726EDFF38066}">
+  <ds:schemaRefs>
+    <ds:schemaRef ds:uri="http://schemas.microsoft.com/office/2006/metadata/properties"/>
+    <ds:schemaRef ds:uri="http://schemas.microsoft.com/office/infopath/2007/PartnerControls"/>
+  </ds:schemaRefs>
+</ds:datastoreItem>
+</file>
+
+<file path=customXml/itemProps2.xml><?xml version="1.0" encoding="utf-8"?>
 <ds:datastoreItem xmlns:ds="http://schemas.openxmlformats.org/officeDocument/2006/customXml" ds:itemID="{B72705D7-B6F2-4418-8CF0-4FB0E5F930F0}">
   <ds:schemaRefs>
     <ds:schemaRef ds:uri="http://schemas.microsoft.com/office/2006/metadata/contentType"/>
@@ -4781,15 +5142,6 @@
 </ds:datastoreItem>
 </file>
 
-<file path=customXml/itemProps2.xml><?xml version="1.0" encoding="utf-8"?>
-<ds:datastoreItem xmlns:ds="http://schemas.openxmlformats.org/officeDocument/2006/customXml" ds:itemID="{7FFCF9B0-A5DD-4ED9-88C0-726EDFF38066}">
-  <ds:schemaRefs>
-    <ds:schemaRef ds:uri="http://schemas.microsoft.com/office/2006/metadata/properties"/>
-    <ds:schemaRef ds:uri="http://schemas.microsoft.com/office/infopath/2007/PartnerControls"/>
-  </ds:schemaRefs>
-</ds:datastoreItem>
-</file>
-
 <file path=customXml/itemProps3.xml><?xml version="1.0" encoding="utf-8"?>
 <ds:datastoreItem xmlns:ds="http://schemas.openxmlformats.org/officeDocument/2006/customXml" ds:itemID="{EA882122-8FF8-4811-96C5-D91925D53CD3}">
   <ds:schemaRefs>

</xml_diff>